<commit_message>
docs(module): update procedure and function module with pedagogical analogies, bridging concepts, and teaching guide from penjelasan_procedure_function.md
</commit_message>
<xml_diff>
--- a/modules/generated/Modul_Pengayaan_SMBD_Lanjut_Procedure_Function.docx
+++ b/modules/generated/Modul_Pengayaan_SMBD_Lanjut_Procedure_Function.docx
@@ -26,13 +26,13 @@
           <w:rFonts w:ascii="Calibri" w:hAnsi="Calibri"/>
           <w:sz w:val="20"/>
         </w:rPr>
-        <w:t>Modul pengayaan ini disusun secara komprehensif untuk melengkapi Materi Praktikum 4 (USER DEFINE FUNCTION &amp; STORE PROCEDURE) pada mata kuliah Sistem Manajemen Basis Data Lanjut (SMBD Lanjut). Fokus modul ini adalah memberikan pemahaman mendalam mengenai arsitektur logika bisnis terkompilasi di sisi server (RDBMS), perbedaan hakiki antara User Defined Function (UDF) dan Stored Procedure, klasifikasi parameter IN, OUT, dan INOUT, mekanisme iterasi baris per baris dengan CURSOR, penanganan eksepsi (Error Handling) menggunakan HANDLER dan SIGNAL SQLSTATE, serta penerapan skenario otomasi transaksi kasir minimarket 3NF lengkap dengan 10 latihan soal bertingkat dan lampiran kunci jawaban khusus asisten/dosen.</w:t>
+        <w:t>Modul pengayaan ini disusun secara terstruktur untuk melengkapi Materi Praktikum 4 (USER DEFINE FUNCTION &amp; STORE PROCEDURE) pada mata kuliah Sistem Manajemen Basis Data Lanjut (SMBD Lanjut). Fokus utama modul ini adalah menjembatani pemahaman mahasiswa dari materi basis data dasar (DDL, DML, dan View) menuju paradigma pemrograman logika bisnis terkompilasi di sisi server (RDBMS). Modul dilengkapi penjelasan analogi dunia nyata, analisis komparasi hakiki UDF vs Stored Procedure, manajemen parameter (IN, OUT, INOUT), struktur perulangan CURSOR baris per baris, penanganan eksepsi terstruktur (SIGNAL &amp; HANDLER), studi kasus kasir 3NF, metodologi mengajar praktikum bagi asisten, serta 10 latihan soal bertingkat beserta kunci jawaban resmi.</w:t>
       </w:r>
     </w:p>
     <w:p>
       <w:pPr>
         <w:keepNext/>
-        <w:spacing w:before="260" w:after="60"/>
+        <w:spacing w:before="280" w:after="80"/>
       </w:pPr>
       <w:r>
         <w:rPr>
@@ -41,7 +41,7 @@
           <w:color w:val="14325F"/>
           <w:sz w:val="22"/>
         </w:rPr>
-        <w:t>1. KONSEP DASAR &amp; ARSITEKTUR STORED ROUTINES</w:t>
+        <w:t>1. JEMBATAN KONSEPTUAL: DARI DDL, DML, VIEW MENUJU STORED ROUTINE</w:t>
       </w:r>
     </w:p>
     <w:p>
@@ -53,22 +53,172 @@
           <w:rFonts w:ascii="Calibri" w:hAnsi="Calibri"/>
           <w:sz w:val="20"/>
         </w:rPr>
-        <w:t>Dalam rekayasa sistem basis data relasional enterprise, Stored Routine adalah blok kode prosedural SQL yang disimpan secara permanen di dalam katalog basis data (data dictionary) dan dieksekusi langsung oleh database engine di sisi server. Stored Routine terdiri dari dua jenis utama: User Defined Function (UDF) dan Stored Procedure.</w:t>
+        <w:t>Sebelum melangkah ke materi Stored Routine, mahasiswa telah menguasai tiga pilar fundamental SQL pada tingkat sebelumnya:</w:t>
+        <w:br/>
+        <w:t>• DDL (Data Definition Language): Digunakan untuk merancang dan mendefinisikan struktur fisik tabel (CREATE TABLE, ALTER, DROP).</w:t>
+        <w:br/>
+        <w:t>• DML (Data Manipulation Language): Digunakan untuk memanipulasi baris data di dalam tabel fisik (SELECT, INSERT, UPDATE, DELETE).</w:t>
+        <w:br/>
+        <w:t>• View: Merupakan kueri SELECT yang disimpan dengan nama di dalam katalog basis data (*virtual table*), yang bertujuan memudahkan pembacaan tanpa menduplikasi data fisik.</w:t>
       </w:r>
     </w:p>
     <w:p>
       <w:pPr>
+        <w:spacing w:after="80" w:line="276" w:lineRule="auto"/>
+      </w:pPr>
+      <w:r>
+        <w:rPr>
+          <w:rFonts w:ascii="Calibri" w:hAnsi="Calibri"/>
+          <w:sz w:val="20"/>
+        </w:rPr>
+        <w:t>Materi Stored Routine adalah satu lompatan besar di atas ketiga konsep tersebut. Jika pada View kita hanya dapat menyajikan proyeksi data dari satu perintah SELECT pasif, maka Stored Routine memungkinkan kita mengeksekusi serangkaian algoritma lengkap: percabangan kondisi, perulangan loop, variabel internal, serta mutasi transaksi pada banyak tabel secara serentak.</w:t>
+      </w:r>
+    </w:p>
+    <w:tbl>
+      <w:tblPr>
+        <w:tblW w:type="auto" w:w="0"/>
+        <w:jc w:val="center"/>
+        <w:tblLook w:firstColumn="1" w:firstRow="1" w:lastColumn="0" w:lastRow="0" w:noHBand="0" w:noVBand="1" w:val="04A0"/>
+      </w:tblPr>
+      <w:tblGrid>
+        <w:gridCol w:w="10080"/>
+      </w:tblGrid>
+      <w:tr>
+        <w:tc>
+          <w:tcPr>
+            <w:tcW w:type="dxa" w:w="10080"/>
+            <w:shd w:fill="F0FDF4"/>
+            <w:tcMar>
+              <w:top w:w="80" w:type="dxa"/>
+              <w:bottom w:w="80" w:type="dxa"/>
+              <w:left w:w="130" w:type="dxa"/>
+              <w:right w:w="130" w:type="dxa"/>
+            </w:tcMar>
+            <w:tcBorders>
+              <w:top w:val="single" w:sz="4" w:space="0" w:color="E2E8F0"/>
+              <w:left w:val="single" w:sz="20" w:space="0" w:color="059669"/>
+              <w:bottom w:val="single" w:sz="4" w:space="0" w:color="E2E8F0"/>
+              <w:right w:val="single" w:sz="4" w:space="0" w:color="E2E8F0"/>
+            </w:tcBorders>
+          </w:tcPr>
+          <w:p>
+            <w:pPr>
+              <w:spacing w:before="0" w:after="0" w:line="276" w:lineRule="auto"/>
+            </w:pPr>
+            <w:r>
+              <w:rPr>
+                <w:rFonts w:ascii="Calibri" w:hAnsi="Calibri"/>
+                <w:b/>
+                <w:color w:val="047857"/>
+                <w:sz w:val="19"/>
+              </w:rPr>
+              <w:t xml:space="preserve">🔑 Kalimat Kunci Pemahaman: </w:t>
+            </w:r>
+            <w:r>
+              <w:rPr>
+                <w:rFonts w:ascii="Calibri" w:hAnsi="Calibri"/>
+                <w:i/>
+                <w:color w:val="1E293B"/>
+                <w:sz w:val="19"/>
+              </w:rPr>
+              <w:t>"Kalau VIEW itu bertugas MENYIMPAN QUERY (tampilan data pasif), maka STORED ROUTINE itu bertugas MENYIMPAN PROGRAM (logika bisnis aktif di dalam database)."</w:t>
+            </w:r>
+          </w:p>
+        </w:tc>
+      </w:tr>
+    </w:tbl>
+    <w:p>
+      <w:pPr>
+        <w:spacing w:before="40" w:after="60"/>
+      </w:pPr>
+    </w:p>
+    <w:tbl>
+      <w:tblPr>
+        <w:tblW w:type="auto" w:w="0"/>
+        <w:jc w:val="center"/>
+        <w:tblLook w:firstColumn="1" w:firstRow="1" w:lastColumn="0" w:lastRow="0" w:noHBand="0" w:noVBand="1" w:val="04A0"/>
+      </w:tblPr>
+      <w:tblGrid>
+        <w:gridCol w:w="10080"/>
+      </w:tblGrid>
+      <w:tr>
+        <w:tc>
+          <w:tcPr>
+            <w:tcW w:type="dxa" w:w="10080"/>
+            <w:shd w:fill="F0F7FF"/>
+            <w:tcMar>
+              <w:top w:w="80" w:type="dxa"/>
+              <w:bottom w:w="80" w:type="dxa"/>
+              <w:left w:w="130" w:type="dxa"/>
+              <w:right w:w="130" w:type="dxa"/>
+            </w:tcMar>
+            <w:tcBorders>
+              <w:top w:val="single" w:sz="4" w:space="0" w:color="E2E8F0"/>
+              <w:left w:val="single" w:sz="20" w:space="0" w:color="1E40AF"/>
+              <w:bottom w:val="single" w:sz="4" w:space="0" w:color="E2E8F0"/>
+              <w:right w:val="single" w:sz="4" w:space="0" w:color="E2E8F0"/>
+            </w:tcBorders>
+          </w:tcPr>
+          <w:p>
+            <w:pPr>
+              <w:spacing w:before="0" w:after="0" w:line="276" w:lineRule="auto"/>
+            </w:pPr>
+            <w:r>
+              <w:rPr>
+                <w:rFonts w:ascii="Calibri" w:hAnsi="Calibri"/>
+                <w:b/>
+                <w:color w:val="1E40AF"/>
+                <w:sz w:val="19"/>
+              </w:rPr>
+              <w:t xml:space="preserve">💡 Analogi Skenario Kasir Minimarket: </w:t>
+            </w:r>
+            <w:r>
+              <w:rPr>
+                <w:rFonts w:ascii="Calibri" w:hAnsi="Calibri"/>
+                <w:i/>
+                <w:color w:val="1E293B"/>
+                <w:sz w:val="19"/>
+              </w:rPr>
+              <w:t>Bayangkan operasional kasir minimarket. Setiap kali ada pelanggan yang berbelanja, sistem kasir harus melakukan rangkaian langkah: (1) cek sisa stok produk di gudang -&gt; (2) kurangi stok fisik barang -&gt; (3) buat nomor nota baru -&gt; (4) cetak item nota -&gt; (5) hitung poin reward member.</w:t>
+              <w:br/>
+              <w:t>Jika langkah-langkah ini ditulis ulang di tiap aplikasi klien (aplikasi POS kasir, aplikasi mobile e-commerce, portal web admin), maka jika terjadi perubahan aturan bisnis (misalnya diskon baru atau skema poin), kode di semua aplikasi klien harus diubah satu per satu. Hal ini berisiko menimbulkan ketidaksinkronan aturan dan celah kecurangan (fraud).</w:t>
+              <w:br/>
+              <w:t>Solusinya: Tulis seluruh urutan langkah tersebut satu kali saja di dalam Stored Routine database. Semua aplikasi klien cukup 'memanggil' subrutin tersebut.</w:t>
+            </w:r>
+          </w:p>
+        </w:tc>
+      </w:tr>
+    </w:tbl>
+    <w:p>
+      <w:pPr>
+        <w:spacing w:before="40" w:after="60"/>
+      </w:pPr>
+    </w:p>
+    <w:p>
+      <w:pPr>
         <w:keepNext/>
-        <w:spacing w:before="160" w:after="40"/>
+        <w:spacing w:before="280" w:after="80"/>
       </w:pPr>
       <w:r>
         <w:rPr>
           <w:rFonts w:ascii="Calibri" w:hAnsi="Calibri"/>
           <w:b/>
-          <w:color w:val="234673"/>
-          <w:sz w:val="21"/>
+          <w:color w:val="14325F"/>
+          <w:sz w:val="22"/>
         </w:rPr>
-        <w:t>1.1 Mengapa Memindahkan Logika Bisnis ke Database?</w:t>
+        <w:t>2. ARSITEKTUR &amp; EMPAT KEUNTUNGAN LOGIKA SISI SERVER</w:t>
+      </w:r>
+    </w:p>
+    <w:p>
+      <w:pPr>
+        <w:spacing w:after="80" w:line="276" w:lineRule="auto"/>
+      </w:pPr>
+      <w:r>
+        <w:rPr>
+          <w:rFonts w:ascii="Calibri" w:hAnsi="Calibri"/>
+          <w:sz w:val="20"/>
+        </w:rPr>
+        <w:t>Dalam rekayasa sistem basis data relasional enterprise (seperti MySQL, MariaDB, Oracle, PostgreSQL), Stored Routine adalah blok instruksi SQL terkompilasi yang disimpan secara permanen di dalam data dictionary (katalog sistem) dan dieksekusi langsung oleh server database engine. Memindahkan logika bisnis dari aplikasi klien langsung ke RDBMS memberikan 4 keunggulan:</w:t>
       </w:r>
     </w:p>
     <w:p>
@@ -92,14 +242,14 @@
           <w:color w:val="1E1E1E"/>
           <w:sz w:val="20"/>
         </w:rPr>
-        <w:t xml:space="preserve">Reduksi Lalu Lintas Jaringan (Network Traffic Optimization): </w:t>
+        <w:t xml:space="preserve">1. Reduksi Lalu Lintas Jaringan (Network Traffic Optimization): </w:t>
       </w:r>
       <w:r>
         <w:rPr>
           <w:rFonts w:ascii="Calibri" w:hAnsi="Calibri"/>
           <w:sz w:val="20"/>
         </w:rPr>
-        <w:t>Pada arsitektur tradisional, aplikasi klien harus mengirimkan belasan kueri SELECT, INSERT, dan UPDATE secara bolak-balik melalui jaringan. Dengan Stored Routine, aplikasi klien cukup mengirimkan satu perintah CALL, dan seluruh rangkaian kueri dieksekusi langsung di memori server, memangkas latensi jaringan secara dramatis.</w:t>
+        <w:t>Pada arsitektur konvensional, aplikasi klien harus mengirimkan belasan kueri SELECT dan UPDATE secara bolak-balik melalui jaringan kabel/WiFi. Dengan Stored Routine, aplikasi cukup mengirimkan satu baris perintah CALL, dan seluruh rangkaian kueri dieksekusi langsung di RAM server, memangkas latensi jaringan secara signifikan.</w:t>
       </w:r>
     </w:p>
     <w:p>
@@ -123,14 +273,14 @@
           <w:color w:val="1E1E1E"/>
           <w:sz w:val="20"/>
         </w:rPr>
-        <w:t xml:space="preserve">Sentralisasi Logika Bisnis (Centralized Business Logic): </w:t>
+        <w:t xml:space="preserve">2. Sentralisasi Logika Bisnis (Centralized Business Logic): </w:t>
       </w:r>
       <w:r>
         <w:rPr>
           <w:rFonts w:ascii="Calibri" w:hAnsi="Calibri"/>
           <w:sz w:val="20"/>
         </w:rPr>
-        <w:t>Logika transaksi kritis—seperti pemotongan stok barang, kalkulasi diskon member, dan akumulasi poin reward—disentralisasi di dalam basis data. Semua aplikasi klien (aplikasi POS kasir, aplikasi mobile e-commerce, web portal admin) memanggil subrutin yang sama, menghilangkan risiko inkonsistensi perhitungan.</w:t>
+        <w:t>Aturan bisnis krusial (misal kalkulasi poin reward, diskon member, validasi batas minimum stok) didefinisikan satu kali secara terpusat di basis data. Seluruh aplikasi klien memakai aturan yang sama persis, menjamin konsistensi mutlak.</w:t>
       </w:r>
     </w:p>
     <w:p>
@@ -154,14 +304,14 @@
           <w:color w:val="1E1E1E"/>
           <w:sz w:val="20"/>
         </w:rPr>
-        <w:t xml:space="preserve">Kompilasi dan Eksekusi Cepat (Execution Plan Caching): </w:t>
+        <w:t xml:space="preserve">3. Kompilasi dan Eksekusi Cepat (Execution Plan Caching): </w:t>
       </w:r>
       <w:r>
         <w:rPr>
           <w:rFonts w:ascii="Calibri" w:hAnsi="Calibri"/>
           <w:sz w:val="20"/>
         </w:rPr>
-        <w:t>Stored Routine dikompilasi satu kali dan rencana eksekusinya disimpan di dalam cache memori RDBMS. Eksekusi berulang tidak memerlukan proses parsing dan optimasi sintaks dari awal, menghasilkan performa eksekusi kueri yang jauh lebih cepat.</w:t>
+        <w:t>RDBMS mem-parsing, memeriksa hak akses, dan mengompilasi kode subrutin pada eksekusi pertama, lalu menyimpan rencana eksekusinya (execution plan) di dalam cache memori buffer. Pemanggilan berikutnya berjalan secara instan tanpa proses kompilasi ulang.</w:t>
       </w:r>
     </w:p>
     <w:p>
@@ -185,30 +335,102 @@
           <w:color w:val="1E1E1E"/>
           <w:sz w:val="20"/>
         </w:rPr>
-        <w:t xml:space="preserve">Lapisan Keamanan Berlapis (Security &amp; Privilege Isolation): </w:t>
+        <w:t xml:space="preserve">4. Lapisan Keamanan &amp; Isolasi Hak Akses (Security &amp; Privilege Isolation): </w:t>
       </w:r>
       <w:r>
         <w:rPr>
           <w:rFonts w:ascii="Calibri" w:hAnsi="Calibri"/>
           <w:sz w:val="20"/>
         </w:rPr>
-        <w:t>Aplikasi kasir tidak perlu diberi izin akses langsung (INSERT/UPDATE) ke tabel fisik PRODUK dan CUSTOMER. Cukup berikan izin EXECUTE pada Stored Procedure checkout, sehingga basis data terlindungi dari manipulasi langsung.</w:t>
+        <w:t>Pengguna aplikasi (seperti kasir atau staf gudang) tidak perlu diberi hak akses langsung (INSERT/UPDATE/DELETE) pada tabel fisik master. Cukup berikan izin EXECUTE pada Stored Procedure tertentu. Dengan demikian, data master aman dari modifikasi liar.</w:t>
       </w:r>
     </w:p>
     <w:p>
       <w:pPr>
         <w:keepNext/>
-        <w:spacing w:before="160" w:after="40"/>
+        <w:spacing w:before="280" w:after="80"/>
       </w:pPr>
       <w:r>
         <w:rPr>
           <w:rFonts w:ascii="Calibri" w:hAnsi="Calibri"/>
           <w:b/>
-          <w:color w:val="234673"/>
-          <w:sz w:val="21"/>
+          <w:color w:val="14325F"/>
+          <w:sz w:val="22"/>
         </w:rPr>
-        <w:t>1.2 Perbedaan Hakiki Function vs Stored Procedure</w:t>
+        <w:t>3. PERBEDAAN HAKIKI: FUNCTION (UDF) VS STORED PROCEDURE</w:t>
       </w:r>
+    </w:p>
+    <w:p>
+      <w:pPr>
+        <w:spacing w:after="80" w:line="276" w:lineRule="auto"/>
+      </w:pPr>
+      <w:r>
+        <w:rPr>
+          <w:rFonts w:ascii="Calibri" w:hAnsi="Calibri"/>
+          <w:sz w:val="20"/>
+        </w:rPr>
+        <w:t>Meskipun sama-sama merupakan blok kode prosedural SQL terkompilasi di sisi server, User Defined Function (UDF) dan Stored Procedure memiliki batasan arsitektural dan tujuan perancangan yang sangat berbeda:</w:t>
+      </w:r>
+    </w:p>
+    <w:tbl>
+      <w:tblPr>
+        <w:tblW w:type="auto" w:w="0"/>
+        <w:jc w:val="center"/>
+        <w:tblLook w:firstColumn="1" w:firstRow="1" w:lastColumn="0" w:lastRow="0" w:noHBand="0" w:noVBand="1" w:val="04A0"/>
+      </w:tblPr>
+      <w:tblGrid>
+        <w:gridCol w:w="10080"/>
+      </w:tblGrid>
+      <w:tr>
+        <w:tc>
+          <w:tcPr>
+            <w:tcW w:type="dxa" w:w="10080"/>
+            <w:shd w:fill="F0F7FF"/>
+            <w:tcMar>
+              <w:top w:w="80" w:type="dxa"/>
+              <w:bottom w:w="80" w:type="dxa"/>
+              <w:left w:w="130" w:type="dxa"/>
+              <w:right w:w="130" w:type="dxa"/>
+            </w:tcMar>
+            <w:tcBorders>
+              <w:top w:val="single" w:sz="4" w:space="0" w:color="E2E8F0"/>
+              <w:left w:val="single" w:sz="20" w:space="0" w:color="1E40AF"/>
+              <w:bottom w:val="single" w:sz="4" w:space="0" w:color="E2E8F0"/>
+              <w:right w:val="single" w:sz="4" w:space="0" w:color="E2E8F0"/>
+            </w:tcBorders>
+          </w:tcPr>
+          <w:p>
+            <w:pPr>
+              <w:spacing w:before="0" w:after="0" w:line="276" w:lineRule="auto"/>
+            </w:pPr>
+            <w:r>
+              <w:rPr>
+                <w:rFonts w:ascii="Calibri" w:hAnsi="Calibri"/>
+                <w:b/>
+                <w:color w:val="1E40AF"/>
+                <w:sz w:val="19"/>
+              </w:rPr>
+              <w:t xml:space="preserve">💡 Analogi Kalkulator vs Mesin Pekerja: </w:t>
+            </w:r>
+            <w:r>
+              <w:rPr>
+                <w:rFonts w:ascii="Calibri" w:hAnsi="Calibri"/>
+                <w:i/>
+                <w:color w:val="1E293B"/>
+                <w:sz w:val="19"/>
+              </w:rPr>
+              <w:t>• FUNCTION ibarat KALKULATOR: Kamu memasukkan angka atau data, dan ia PASTI mengembalikan tepat SATU hasil nilai kembalian (via klausa RETURN). Dipakai di dalam kueri SELECT biasa.</w:t>
+              <w:br/>
+              <w:t>• STORED PROCEDURE ibarat ROBOT / MESIN PEKERJA: Kamu memerintahkannya untuk menjalankan serangkaian tindakan atau pekerjaan nyata (memeriksa data, mengubah tabel, memotong stok, membatalkan transaksi). Dipanggil secara mandiri dengan perintah CALL.</w:t>
+            </w:r>
+          </w:p>
+        </w:tc>
+      </w:tr>
+    </w:tbl>
+    <w:p>
+      <w:pPr>
+        <w:spacing w:before="40" w:after="60"/>
+      </w:pPr>
     </w:p>
     <w:tbl>
       <w:tblPr>
@@ -357,7 +579,7 @@
                 <w:color w:val="282828"/>
                 <w:sz w:val="17"/>
               </w:rPr>
-              <w:t>Wajib mengembalikan satu nilai skalar tunggal melalui klausa RETURNS dan pernyataan RETURN.</w:t>
+              <w:t>Wajib mengembalikan tepat satu nilai skalar tunggal melalui klausa RETURNS dan pernyataan RETURN.</w:t>
             </w:r>
           </w:p>
         </w:tc>
@@ -382,7 +604,7 @@
                 <w:color w:val="282828"/>
                 <w:sz w:val="17"/>
               </w:rPr>
-              <w:t>Tidak mengembalikan nilai melalui klausa RETURN; dapat mengembalikan nilai via parameter OUT/INOUT atau result set.</w:t>
+              <w:t>Tidak mengembalikan nilai melalui klausa RETURN; dapat menghasilkan nilai lewat parameter bertipe OUT/INOUT atau menampilkan result set.</w:t>
             </w:r>
           </w:p>
         </w:tc>
@@ -435,7 +657,7 @@
                 <w:color w:val="282828"/>
                 <w:sz w:val="17"/>
               </w:rPr>
-              <w:t>Dipanggil di dalam ekspresi kueri SQL biasa (contoh: SELECT fc_name(), WHERE fc_name() &gt; 0).</w:t>
+              <w:t>Dipanggil di dalam ekspresi kueri SQL biasa (contoh: SELECT fc_name(), WHERE fc_name() &gt; 0, ORDER BY fc_name()).</w:t>
             </w:r>
           </w:p>
         </w:tc>
@@ -460,7 +682,7 @@
                 <w:color w:val="282828"/>
                 <w:sz w:val="17"/>
               </w:rPr>
-              <w:t>Dipanggil secara mandiri menggunakan perintah eksplisit: CALL proc_name(param).</w:t>
+              <w:t>Dipanggil secara mandiri sebagai perintah terpisah menggunakan sintaks khusus: CALL proc_name(argumen);.</w:t>
             </w:r>
           </w:p>
         </w:tc>
@@ -513,7 +735,7 @@
                 <w:color w:val="282828"/>
                 <w:sz w:val="17"/>
               </w:rPr>
-              <w:t>Sangat dibatasi; secara standar tidak boleh melakukan modifikasi data (INSERT/UPDATE/DELETE) yang mengubah state tabel.</w:t>
+              <w:t>Sangat dibatasi; secara standar tidak diperbolehkan melakukan operasi modifikasi data tabel fisik (INSERT/UPDATE/DELETE) saat dipanggil oleh kueri baca.</w:t>
             </w:r>
           </w:p>
         </w:tc>
@@ -538,7 +760,7 @@
                 <w:color w:val="282828"/>
                 <w:sz w:val="17"/>
               </w:rPr>
-              <w:t>Mendukung eksekusi DML penuh, transaksi (COMMIT/ROLLBACK), dynamic SQL, dan pemanggilan procedure lain.</w:t>
+              <w:t>Mendukung eksekusi DML penuh secara bebas: dapat menyisipkan, memperbarui, menghapus baris tabel, serta mengontrol transaksi ACID (COMMIT/ROLLBACK).</w:t>
             </w:r>
           </w:p>
         </w:tc>
@@ -566,7 +788,7 @@
                 <w:color w:val="282828"/>
                 <w:sz w:val="17"/>
               </w:rPr>
-              <w:t>Tujuan Utama</w:t>
+              <w:t>Fokus Penggunaan</w:t>
             </w:r>
           </w:p>
         </w:tc>
@@ -591,7 +813,7 @@
                 <w:color w:val="282828"/>
                 <w:sz w:val="17"/>
               </w:rPr>
-              <w:t>Melakukan kalkulasi matematis, manipulasi teks, atau transformasi data yang menghasilkan nilai tunggal.</w:t>
+              <w:t>Kalkulasi matematis, manipulasi format teks, konversi mata uang, atau penentuan kategori/tier berbasis rumus murni.</w:t>
             </w:r>
           </w:p>
         </w:tc>
@@ -616,7 +838,7 @@
                 <w:color w:val="282828"/>
                 <w:sz w:val="17"/>
               </w:rPr>
-              <w:t>Mengeksekusi alur kerja bisnis lengkap, batch processing, dan transaksi multi-tabel.</w:t>
+              <w:t>Mengeksekusi alur kerja transaksi bisnis multi-tabel, batch processing berkala, dan otomasi checkout kasir.</w:t>
             </w:r>
           </w:p>
         </w:tc>
@@ -630,7 +852,7 @@
     <w:p>
       <w:pPr>
         <w:keepNext/>
-        <w:spacing w:before="260" w:after="60"/>
+        <w:spacing w:before="280" w:after="80"/>
       </w:pPr>
       <w:r>
         <w:rPr>
@@ -639,7 +861,7 @@
           <w:color w:val="14325F"/>
           <w:sz w:val="22"/>
         </w:rPr>
-        <w:t>2. USER DEFINED FUNCTION (UDF) DI MYSQL</w:t>
+        <w:t>4. USER DEFINED FUNCTION (UDF) DI MYSQL</w:t>
       </w:r>
     </w:p>
     <w:p>
@@ -651,13 +873,13 @@
           <w:rFonts w:ascii="Calibri" w:hAnsi="Calibri"/>
           <w:sz w:val="20"/>
         </w:rPr>
-        <w:t>User Defined Function memungkinkan perancang basis data membuat fungsi matematis, pemformatan string, dan logika kustom yang belum disediakan oleh fungsi bawaan (built-in functions) MySQL.</w:t>
+        <w:t>MySQL telah menyediakan beragam fungsi bawaan seperti UPPER(), NOW(), FORMAT(), dan CONCAT(). Namun, saat pengembang membutuhkan fungsi kalkulasi khusus yang spesifik untuk bisnis mereka (seperti rumus diskon member bertingkat atau format mata uang rupiah), maka dibuatlah User Defined Function (UDF).</w:t>
       </w:r>
     </w:p>
     <w:p>
       <w:pPr>
         <w:keepNext/>
-        <w:spacing w:before="160" w:after="40"/>
+        <w:spacing w:before="180" w:after="40"/>
       </w:pPr>
       <w:r>
         <w:rPr>
@@ -666,7 +888,7 @@
           <w:color w:val="234673"/>
           <w:sz w:val="21"/>
         </w:rPr>
-        <w:t>2.1 Sintaks Lengkap Deklarasi Function</w:t>
+        <w:t>4.1 Sintaks Lengkap Deklarasi UDF</w:t>
       </w:r>
     </w:p>
     <w:tbl>
@@ -740,7 +962,7 @@
     <w:p>
       <w:pPr>
         <w:keepNext/>
-        <w:spacing w:before="160" w:after="40"/>
+        <w:spacing w:before="180" w:after="40"/>
       </w:pPr>
       <w:r>
         <w:rPr>
@@ -749,106 +971,153 @@
           <w:color w:val="234673"/>
           <w:sz w:val="21"/>
         </w:rPr>
-        <w:t>2.2 Karakteristik Penentu Function</w:t>
+        <w:t>4.2 Dua Hal Kritis yang Sering Ditanyakan Mahasiswa</w:t>
       </w:r>
     </w:p>
     <w:p>
       <w:pPr>
-        <w:spacing w:after="60" w:line="269" w:lineRule="auto"/>
-        <w:ind w:left="360" w:hanging="259"/>
+        <w:spacing w:after="80" w:line="276" w:lineRule="auto"/>
       </w:pPr>
-      <w:r>
-        <w:rPr>
-          <w:rFonts w:ascii="Calibri" w:hAnsi="Calibri"/>
-          <w:b/>
-          <w:color w:val="28466E"/>
-          <w:sz w:val="20"/>
-        </w:rPr>
-        <w:t xml:space="preserve">• </w:t>
-      </w:r>
-      <w:r>
-        <w:rPr>
-          <w:rFonts w:ascii="Calibri" w:hAnsi="Calibri"/>
-          <w:b/>
-          <w:color w:val="1E1E1E"/>
-          <w:sz w:val="20"/>
-        </w:rPr>
-        <w:t xml:space="preserve">DETERMINISTIC: </w:t>
-      </w:r>
       <w:r>
         <w:rPr>
           <w:rFonts w:ascii="Calibri" w:hAnsi="Calibri"/>
           <w:sz w:val="20"/>
         </w:rPr>
-        <w:t>Fungsi selalu menghasilkan nilai keluaran yang sama jika diberikan argumen input yang sama. Contoh: fungsi penambah angka atau pemotong string. Wajib dideklarasikan pada sistem dengan binary logging aktif.</w:t>
+        <w:t>Dalam sesi praktikum di laboratorium, mahasiswa sering kali mengalami kegagalan pada dua aspek fundamental berikut:</w:t>
       </w:r>
     </w:p>
+    <w:tbl>
+      <w:tblPr>
+        <w:tblW w:type="auto" w:w="0"/>
+        <w:jc w:val="center"/>
+        <w:tblLook w:firstColumn="1" w:firstRow="1" w:lastColumn="0" w:lastRow="0" w:noHBand="0" w:noVBand="1" w:val="04A0"/>
+      </w:tblPr>
+      <w:tblGrid>
+        <w:gridCol w:w="10080"/>
+      </w:tblGrid>
+      <w:tr>
+        <w:tc>
+          <w:tcPr>
+            <w:tcW w:type="dxa" w:w="10080"/>
+            <w:shd w:fill="FFFBEB"/>
+            <w:tcMar>
+              <w:top w:w="80" w:type="dxa"/>
+              <w:bottom w:w="80" w:type="dxa"/>
+              <w:left w:w="130" w:type="dxa"/>
+              <w:right w:w="130" w:type="dxa"/>
+            </w:tcMar>
+            <w:tcBorders>
+              <w:top w:val="single" w:sz="4" w:space="0" w:color="E2E8F0"/>
+              <w:left w:val="single" w:sz="20" w:space="0" w:color="D97706"/>
+              <w:bottom w:val="single" w:sz="4" w:space="0" w:color="E2E8F0"/>
+              <w:right w:val="single" w:sz="4" w:space="0" w:color="E2E8F0"/>
+            </w:tcBorders>
+          </w:tcPr>
+          <w:p>
+            <w:pPr>
+              <w:spacing w:before="0" w:after="0" w:line="276" w:lineRule="auto"/>
+            </w:pPr>
+            <w:r>
+              <w:rPr>
+                <w:rFonts w:ascii="Calibri" w:hAnsi="Calibri"/>
+                <w:b/>
+                <w:color w:val="B45309"/>
+                <w:sz w:val="19"/>
+              </w:rPr>
+              <w:t xml:space="preserve">1. Mengapa Wajib Menggunakan DELIMITER $$? </w:t>
+            </w:r>
+            <w:r>
+              <w:rPr>
+                <w:rFonts w:ascii="Calibri" w:hAnsi="Calibri"/>
+                <w:i/>
+                <w:color w:val="1E293B"/>
+                <w:sz w:val="19"/>
+              </w:rPr>
+              <w:t>Secara bawaan, MySQL menganggap tanda titik-koma (;) sebagai 'akhir dari satu perintah kueri'. Di dalam tubuh blok BEGIN...END suatu Function atau Procedure, terdapat banyak pernyataan logika yang masing-masing diakhiri dengan titik-koma (;). Jika delimiter tidak diganti, MySQL akan mengira perintah terputus pada titik-koma pertama, sehingga menghasilkan sintaks galat (Syntax Error).</w:t>
+              <w:br/>
+              <w:t>Oleh karena itu, sebelum menulis blok routine, kita ubah sementara tanda akhir perintah menjadi '$$' menggunakan perintah DELIMITER $$. Setelah blok ditutup dengan END$$, kita kembalikan lagi tanda akhir perintah ke titik-koma standar dengan DELIMITER ;</w:t>
+              <w:br/>
+              <w:t>Analogi: Memberi tahu sistem bahwa tanda titik pada paragraf ini adalah tanda baca biasa, dan akhir dari seluruh cerita ditandai dengan tanda '$$'.</w:t>
+            </w:r>
+          </w:p>
+        </w:tc>
+      </w:tr>
+    </w:tbl>
     <w:p>
       <w:pPr>
-        <w:spacing w:after="60" w:line="269" w:lineRule="auto"/>
-        <w:ind w:left="360" w:hanging="259"/>
+        <w:spacing w:before="40" w:after="60"/>
       </w:pPr>
-      <w:r>
-        <w:rPr>
-          <w:rFonts w:ascii="Calibri" w:hAnsi="Calibri"/>
-          <w:b/>
-          <w:color w:val="28466E"/>
-          <w:sz w:val="20"/>
-        </w:rPr>
-        <w:t xml:space="preserve">• </w:t>
-      </w:r>
-      <w:r>
-        <w:rPr>
-          <w:rFonts w:ascii="Calibri" w:hAnsi="Calibri"/>
-          <w:b/>
-          <w:color w:val="1E1E1E"/>
-          <w:sz w:val="20"/>
-        </w:rPr>
-        <w:t xml:space="preserve">NOT DETERMINISTIC: </w:t>
-      </w:r>
-      <w:r>
-        <w:rPr>
-          <w:rFonts w:ascii="Calibri" w:hAnsi="Calibri"/>
-          <w:sz w:val="20"/>
-        </w:rPr>
-        <w:t>Fungsi dapat menghasilkan nilai berbeda meskipun argumennya sama (contoh: fungsi yang membaca waktu saat ini NOW() atau membaca data tabel fisik yang dinamis).</w:t>
-      </w:r>
     </w:p>
+    <w:tbl>
+      <w:tblPr>
+        <w:tblW w:type="auto" w:w="0"/>
+        <w:jc w:val="center"/>
+        <w:tblLook w:firstColumn="1" w:firstRow="1" w:lastColumn="0" w:lastRow="0" w:noHBand="0" w:noVBand="1" w:val="04A0"/>
+      </w:tblPr>
+      <w:tblGrid>
+        <w:gridCol w:w="10080"/>
+      </w:tblGrid>
+      <w:tr>
+        <w:tc>
+          <w:tcPr>
+            <w:tcW w:type="dxa" w:w="10080"/>
+            <w:shd w:fill="F0FDF4"/>
+            <w:tcMar>
+              <w:top w:w="80" w:type="dxa"/>
+              <w:bottom w:w="80" w:type="dxa"/>
+              <w:left w:w="130" w:type="dxa"/>
+              <w:right w:w="130" w:type="dxa"/>
+            </w:tcMar>
+            <w:tcBorders>
+              <w:top w:val="single" w:sz="4" w:space="0" w:color="E2E8F0"/>
+              <w:left w:val="single" w:sz="20" w:space="0" w:color="059669"/>
+              <w:bottom w:val="single" w:sz="4" w:space="0" w:color="E2E8F0"/>
+              <w:right w:val="single" w:sz="4" w:space="0" w:color="E2E8F0"/>
+            </w:tcBorders>
+          </w:tcPr>
+          <w:p>
+            <w:pPr>
+              <w:spacing w:before="0" w:after="0" w:line="276" w:lineRule="auto"/>
+            </w:pPr>
+            <w:r>
+              <w:rPr>
+                <w:rFonts w:ascii="Calibri" w:hAnsi="Calibri"/>
+                <w:b/>
+                <w:color w:val="047857"/>
+                <w:sz w:val="19"/>
+              </w:rPr>
+              <w:t xml:space="preserve">2. Makna Karakteristik DETERMINISTIC, NO SQL &amp; READS SQL DATA: </w:t>
+            </w:r>
+            <w:r>
+              <w:rPr>
+                <w:rFonts w:ascii="Calibri" w:hAnsi="Calibri"/>
+                <w:i/>
+                <w:color w:val="1E293B"/>
+                <w:sz w:val="19"/>
+              </w:rPr>
+              <w:t>Klausa karakteristik memberi tahu query optimizer dan sistem binary logging bagaimana memperlakukan fungsi tersebut:</w:t>
+              <w:br/>
+              <w:t>• DETERMINISTIC: Jika diberi input yang sama, fungsi DIJAMIN selalu menghasilkan output yang sama (misal: perhitungan matematika atau pemformatan teks).</w:t>
+              <w:br/>
+              <w:t>• NOT DETERMINISTIC: Fungsi dapat menghasilkan nilai berbeda meski input sama (misal fungsi yang membaca waktu NOW() atau membaca data tabel fisik yang dinamis).</w:t>
+              <w:br/>
+              <w:t>• NO SQL: Menandakan bahwa fungsi murni kalkulasi matematis tanpa membaca atau menyentuh tabel sama sekali.</w:t>
+              <w:br/>
+              <w:t>• READS SQL DATA: Menandakan fungsi membaca data tabel (memakai SELECT), tetapi tidak memodifikasi data tabel.</w:t>
+            </w:r>
+          </w:p>
+        </w:tc>
+      </w:tr>
+    </w:tbl>
     <w:p>
       <w:pPr>
-        <w:spacing w:after="60" w:line="269" w:lineRule="auto"/>
-        <w:ind w:left="360" w:hanging="259"/>
+        <w:spacing w:before="40" w:after="60"/>
       </w:pPr>
-      <w:r>
-        <w:rPr>
-          <w:rFonts w:ascii="Calibri" w:hAnsi="Calibri"/>
-          <w:b/>
-          <w:color w:val="28466E"/>
-          <w:sz w:val="20"/>
-        </w:rPr>
-        <w:t xml:space="preserve">• </w:t>
-      </w:r>
-      <w:r>
-        <w:rPr>
-          <w:rFonts w:ascii="Calibri" w:hAnsi="Calibri"/>
-          <w:b/>
-          <w:color w:val="1E1E1E"/>
-          <w:sz w:val="20"/>
-        </w:rPr>
-        <w:t xml:space="preserve">READS SQL DATA: </w:t>
-      </w:r>
-      <w:r>
-        <w:rPr>
-          <w:rFonts w:ascii="Calibri" w:hAnsi="Calibri"/>
-          <w:sz w:val="20"/>
-        </w:rPr>
-        <w:t>Memberitahukan kepada query optimizer bahwa fungsi hanya membaca data dari tabel (SELECT) tanpa melakukan mutasi data.</w:t>
-      </w:r>
     </w:p>
     <w:p>
       <w:pPr>
         <w:keepNext/>
-        <w:spacing w:before="160" w:after="40"/>
+        <w:spacing w:before="180" w:after="40"/>
       </w:pPr>
       <w:r>
         <w:rPr>
@@ -857,7 +1126,7 @@
           <w:color w:val="234673"/>
           <w:sz w:val="21"/>
         </w:rPr>
-        <w:t>2.3 Contoh Implementasi UDF: Generator Kode &amp; Poin Belanja</w:t>
+        <w:t>4.3 Contoh Implementasi UDF: Generator Kode Nota &amp; Kalkulasi Poin</w:t>
       </w:r>
     </w:p>
     <w:tbl>
@@ -897,14 +1166,12 @@
                 <w:color w:val="1E2D41"/>
                 <w:sz w:val="17"/>
               </w:rPr>
-              <w:t>-- 1. Mengubah Delimiter agar titik-koma di dalam blok BEGIN-END tidak memutus eksekusi</w:t>
-              <w:br/>
               <w:t>DELIMITER $$</w:t>
               <w:br/>
               <w:br/>
-              <w:t>-- 2. Function Generator Nomor Nota Transaksi Otomatis (Format: YYMMDDXXXX)</w:t>
-              <w:br/>
-              <w:t>CREATE FUNCTION fcGenerateNoNota(tgl DATE)</w:t>
+              <w:t>-- Fungsi 1: Generator Nomor Nota Unik Berbasis Tanggal (READS SQL DATA)</w:t>
+              <w:br/>
+              <w:t>CREATE FUNCTION fcGenerateNoNota(p_tanggal DATE)</w:t>
               <w:br/>
               <w:t>RETURNS CHAR(10)</w:t>
               <w:br/>
@@ -914,40 +1181,42 @@
               <w:br/>
               <w:t>BEGIN</w:t>
               <w:br/>
-              <w:t xml:space="preserve">    DECLARE tgl_prefix CHAR(6);</w:t>
-              <w:br/>
-              <w:t xml:space="preserve">    DECLARE last_seq INT DEFAULT 0;</w:t>
-              <w:br/>
-              <w:t xml:space="preserve">    DECLARE new_nota CHAR(10);</w:t>
+              <w:t xml:space="preserve">    DECLARE v_prefix CHAR(6);</w:t>
+              <w:br/>
+              <w:t xml:space="preserve">    DECLARE v_last_no INT DEFAULT 0;</w:t>
+              <w:br/>
+              <w:t xml:space="preserve">    DECLARE v_new_nonota CHAR(10);</w:t>
               <w:br/>
               <w:t xml:space="preserve">    </w:t>
               <w:br/>
-              <w:t xml:space="preserve">    -- Mengambil format YYMMDD (contoh: 2022-08-03 -&gt; '220803')</w:t>
-              <w:br/>
-              <w:t xml:space="preserve">    SET tgl_prefix = DATE_FORMAT(tgl, '%y%m%d');</w:t>
+              <w:t xml:space="preserve">    -- Format Prefix: YYMMDD (Contoh: 220803)</w:t>
+              <w:br/>
+              <w:t xml:space="preserve">    SET v_prefix = DATE_FORMAT(p_tanggal, '%y%m%d');</w:t>
               <w:br/>
               <w:t xml:space="preserve">    </w:t>
               <w:br/>
-              <w:t xml:space="preserve">    -- Mencari nomor urut transaksi terakhir pada tanggal tersebut</w:t>
-              <w:br/>
-              <w:t xml:space="preserve">    SELECT IFNULL(MAX(CAST(RIGHT(nonota, 4) AS UNSIGNED)), 0) INTO last_seq</w:t>
+              <w:t xml:space="preserve">    -- Cari nomor urut nota tertinggi pada tanggal bersangkutan</w:t>
+              <w:br/>
+              <w:t xml:space="preserve">    SELECT IFNULL(MAX(CAST(RIGHT(nonota, 4) AS UNSIGNED)), 0)</w:t>
+              <w:br/>
+              <w:t xml:space="preserve">    INTO v_last_no</w:t>
               <w:br/>
               <w:t xml:space="preserve">    FROM nota</w:t>
               <w:br/>
-              <w:t xml:space="preserve">    WHERE LEFT(nonota, 6) = tgl_prefix;</w:t>
+              <w:t xml:space="preserve">    WHERE LEFT(nonota, 6) = v_prefix;</w:t>
               <w:br/>
               <w:t xml:space="preserve">    </w:t>
               <w:br/>
-              <w:t xml:space="preserve">    -- Menggabungkan tanggal prefix dengan 4 digit nomor urut baru</w:t>
-              <w:br/>
-              <w:t xml:space="preserve">    SET new_nota = CONCAT(tgl_prefix, LPAD(last_seq + 1, 4, '0'));</w:t>
-              <w:br/>
-              <w:t xml:space="preserve">    RETURN new_nota;</w:t>
+              <w:t xml:space="preserve">    -- Format Hasil: YYMMDDXXXX (Contoh: 2208030001)</w:t>
+              <w:br/>
+              <w:t xml:space="preserve">    SET v_new_nonota = CONCAT(v_prefix, LPAD(v_last_no + 1, 4, '0'));</w:t>
+              <w:br/>
+              <w:t xml:space="preserve">    RETURN v_new_nonota;</w:t>
               <w:br/>
               <w:t>END$$</w:t>
               <w:br/>
               <w:br/>
-              <w:t>-- 3. Function Kalkulasi Poin Belanja (1 Poin tiap kelipatan Rp 10.000)</w:t>
+              <w:t>-- Fungsi 2: Kalkulator Poin Belanja Kelipatan Rp10.000 (NO SQL)</w:t>
               <w:br/>
               <w:t>CREATE FUNCTION fcHitungPoinBelanja(total_belanja INT)</w:t>
               <w:br/>
@@ -975,11 +1244,13 @@
               <w:t>DELIMITER ;</w:t>
               <w:br/>
               <w:br/>
-              <w:t>-- Pengujian Eksekusi:</w:t>
-              <w:br/>
-              <w:t>SELECT fcGenerateNoNota('2022-08-03') AS nota_baru;</w:t>
-              <w:br/>
-              <w:t>SELECT fcHitungPoinBelanja(14800) AS poin_diperoleh;</w:t>
+              <w:t>-- Pengujian Eksekusi (Dipanggil langsung di dalam ekspresi SELECT):</w:t>
+              <w:br/>
+              <w:t>SELECT fcGenerateNoNota('2022-08-03') AS 'Nomor Nota Baru';</w:t>
+              <w:br/>
+              <w:t>SELECT fcHitungPoinBelanja(14800) AS 'Poin Pembelian (14.800)'; -- Output: 1</w:t>
+              <w:br/>
+              <w:t>SELECT fcHitungPoinBelanja(45000) AS 'Poin Pembelian (45.000)'; -- Output: 4</w:t>
             </w:r>
           </w:p>
         </w:tc>
@@ -993,7 +1264,7 @@
     <w:p>
       <w:pPr>
         <w:keepNext/>
-        <w:spacing w:before="260" w:after="60"/>
+        <w:spacing w:before="280" w:after="80"/>
       </w:pPr>
       <w:r>
         <w:rPr>
@@ -1002,7 +1273,7 @@
           <w:color w:val="14325F"/>
           <w:sz w:val="22"/>
         </w:rPr>
-        <w:t>3. STORED PROCEDURE: MANAJEMEN PARAMETER &amp; TRANSAKSI</w:t>
+        <w:t>5. STORED PROCEDURE: MANAJEMEN PARAMETER IN, OUT, DAN INOUT</w:t>
       </w:r>
     </w:p>
     <w:p>
@@ -1014,23 +1285,72 @@
           <w:rFonts w:ascii="Calibri" w:hAnsi="Calibri"/>
           <w:sz w:val="20"/>
         </w:rPr>
-        <w:t>Stored Procedure dirancang untuk menangani tugas transaksi yang kompleks. Parameter pada Stored Procedure dapat dikonfigurasikan ke dalam tiga mode interaksi data:</w:t>
+        <w:t>Stored Procedure dirancang untuk menangani tugas transaksi yang kompleks dan multi-tabel. Salah satu keunggulan terbesar Stored Procedure adalah fleksibilitas parameternya, yang dapat diklasifikasikan ke dalam tiga mode interaksi data:</w:t>
       </w:r>
     </w:p>
+    <w:tbl>
+      <w:tblPr>
+        <w:tblW w:type="auto" w:w="0"/>
+        <w:jc w:val="center"/>
+        <w:tblLook w:firstColumn="1" w:firstRow="1" w:lastColumn="0" w:lastRow="0" w:noHBand="0" w:noVBand="1" w:val="04A0"/>
+      </w:tblPr>
+      <w:tblGrid>
+        <w:gridCol w:w="10080"/>
+      </w:tblGrid>
+      <w:tr>
+        <w:tc>
+          <w:tcPr>
+            <w:tcW w:type="dxa" w:w="10080"/>
+            <w:shd w:fill="F0F7FF"/>
+            <w:tcMar>
+              <w:top w:w="80" w:type="dxa"/>
+              <w:bottom w:w="80" w:type="dxa"/>
+              <w:left w:w="130" w:type="dxa"/>
+              <w:right w:w="130" w:type="dxa"/>
+            </w:tcMar>
+            <w:tcBorders>
+              <w:top w:val="single" w:sz="4" w:space="0" w:color="E2E8F0"/>
+              <w:left w:val="single" w:sz="20" w:space="0" w:color="1E40AF"/>
+              <w:bottom w:val="single" w:sz="4" w:space="0" w:color="E2E8F0"/>
+              <w:right w:val="single" w:sz="4" w:space="0" w:color="E2E8F0"/>
+            </w:tcBorders>
+          </w:tcPr>
+          <w:p>
+            <w:pPr>
+              <w:spacing w:before="0" w:after="0" w:line="276" w:lineRule="auto"/>
+            </w:pPr>
+            <w:r>
+              <w:rPr>
+                <w:rFonts w:ascii="Calibri" w:hAnsi="Calibri"/>
+                <w:b/>
+                <w:color w:val="1E40AF"/>
+                <w:sz w:val="19"/>
+              </w:rPr>
+              <w:t xml:space="preserve">💡 Analogi Tiga Mode Parameter: Mesin Fotokopi: </w:t>
+            </w:r>
+            <w:r>
+              <w:rPr>
+                <w:rFonts w:ascii="Calibri" w:hAnsi="Calibri"/>
+                <w:i/>
+                <w:color w:val="1E293B"/>
+                <w:sz w:val="19"/>
+              </w:rPr>
+              <w:t>Bayangkan mesin fotokopi di kantor administrasi:</w:t>
+              <w:br/>
+              <w:t>• Parameter IN ibarat LEMBAR ASLI yang kamu masukkan ke scanner: Mesin membaca isinya untuk diproses, namun kertas asli milikmu tidak akan berubah sama sekali.</w:t>
+              <w:br/>
+              <w:t>• Parameter OUT ibarat LEMBAR FOTOKOPI KELUAR: Awalnya kosong/NULL, lalu mesin mengisinya dengan hasil proses, dan lembaran tersebut kamu bawa pulang sebagai hasil akhir.</w:t>
+              <w:br/>
+              <w:t>• Parameter INOUT ibarat FORMULIR PENDAFTARAN: Kamu memasukkan satu lembar formulir berisi data awal, mesin/petugas menambahkan cap atau nomor registrasi baru pada lembaran tersebut, lalu mengembalikannya kepadamu.</w:t>
+            </w:r>
+          </w:p>
+        </w:tc>
+      </w:tr>
+    </w:tbl>
     <w:p>
       <w:pPr>
-        <w:keepNext/>
-        <w:spacing w:before="160" w:after="40"/>
+        <w:spacing w:before="40" w:after="60"/>
       </w:pPr>
-      <w:r>
-        <w:rPr>
-          <w:rFonts w:ascii="Calibri" w:hAnsi="Calibri"/>
-          <w:b/>
-          <w:color w:val="234673"/>
-          <w:sz w:val="21"/>
-        </w:rPr>
-        <w:t>3.1 Tiga Mode Parameter Stored Procedure</w:t>
-      </w:r>
     </w:p>
     <w:tbl>
       <w:tblPr>
@@ -1126,7 +1446,7 @@
                 <w:color w:val="FFFFFF"/>
                 <w:sz w:val="18"/>
               </w:rPr>
-              <w:t>Karakteristik &amp; Perilaku Teknis</w:t>
+              <w:t>Karakteristik &amp; Analogi Praktis</w:t>
             </w:r>
           </w:p>
         </w:tc>
@@ -1204,7 +1524,7 @@
                 <w:color w:val="282828"/>
                 <w:sz w:val="17"/>
               </w:rPr>
-              <w:t>Nilai dilewatkan ke dalam procedure sebagai input. Procedure dapat membaca nilai tersebut, namun perubahan variabel di dalam procedure tidak akan mempengaruhi nilai pemanggil.</w:t>
+              <w:t>Nilai dikirim masuk ke dalam procedure sebagai input baca. Modifikasi variabel di dalam procedure tidak mempengaruhi variabel pemanggil.</w:t>
             </w:r>
           </w:p>
         </w:tc>
@@ -1282,7 +1602,7 @@
                 <w:color w:val="282828"/>
                 <w:sz w:val="17"/>
               </w:rPr>
-              <w:t>Variabel diinisialisasi sebagai NULL di dalam procedure. Procedure mengisinya dengan hasil perhitungan, dan nilai tersebut dikembalikan ke pemanggil saat procedure selesai.</w:t>
+              <w:t>Variabel bernilai NULL saat masuk. Procedure melakukan kalkulasi dan mengisi nilai ke dalamnya untuk diambil kembali oleh pemanggil saat selesai.</w:t>
             </w:r>
           </w:p>
         </w:tc>
@@ -1360,7 +1680,65 @@
                 <w:color w:val="282828"/>
                 <w:sz w:val="17"/>
               </w:rPr>
-              <w:t>Variabel membawa nilai awal dari pemanggil ke dalam procedure, nilainya dimodifikasi oleh procedure, dan nilai hasil akhirnya dikembalikan ke pemanggil.</w:t>
+              <w:t>Variabel membawa nilai awal masuk, nilainya diperbarui di dalam procedure, dan nilai hasil akhirnya dikembalikan ke pemanggil.</w:t>
+            </w:r>
+          </w:p>
+        </w:tc>
+      </w:tr>
+    </w:tbl>
+    <w:p>
+      <w:pPr>
+        <w:spacing w:before="40" w:after="60"/>
+      </w:pPr>
+    </w:p>
+    <w:tbl>
+      <w:tblPr>
+        <w:tblW w:type="auto" w:w="0"/>
+        <w:jc w:val="center"/>
+        <w:tblLook w:firstColumn="1" w:firstRow="1" w:lastColumn="0" w:lastRow="0" w:noHBand="0" w:noVBand="1" w:val="04A0"/>
+      </w:tblPr>
+      <w:tblGrid>
+        <w:gridCol w:w="10080"/>
+      </w:tblGrid>
+      <w:tr>
+        <w:tc>
+          <w:tcPr>
+            <w:tcW w:type="dxa" w:w="10080"/>
+            <w:shd w:fill="FFFBEB"/>
+            <w:tcMar>
+              <w:top w:w="80" w:type="dxa"/>
+              <w:bottom w:w="80" w:type="dxa"/>
+              <w:left w:w="130" w:type="dxa"/>
+              <w:right w:w="130" w:type="dxa"/>
+            </w:tcMar>
+            <w:tcBorders>
+              <w:top w:val="single" w:sz="4" w:space="0" w:color="E2E8F0"/>
+              <w:left w:val="single" w:sz="20" w:space="0" w:color="D97706"/>
+              <w:bottom w:val="single" w:sz="4" w:space="0" w:color="E2E8F0"/>
+              <w:right w:val="single" w:sz="4" w:space="0" w:color="E2E8F0"/>
+            </w:tcBorders>
+          </w:tcPr>
+          <w:p>
+            <w:pPr>
+              <w:spacing w:before="0" w:after="0" w:line="276" w:lineRule="auto"/>
+            </w:pPr>
+            <w:r>
+              <w:rPr>
+                <w:rFonts w:ascii="Calibri" w:hAnsi="Calibri"/>
+                <w:b/>
+                <w:color w:val="B45309"/>
+                <w:sz w:val="19"/>
+              </w:rPr>
+              <w:t xml:space="preserve">📌 Variabel Sesi Bertanda @: </w:t>
+            </w:r>
+            <w:r>
+              <w:rPr>
+                <w:rFonts w:ascii="Calibri" w:hAnsi="Calibri"/>
+                <w:i/>
+                <w:color w:val="1E293B"/>
+                <w:sz w:val="19"/>
+              </w:rPr>
+              <w:t>Untuk menampung nilai hasil dari parameter OUT dan INOUT, kita menggunakan variabel sesi yang diawali simbol '@' (misal: @kode_baru atau @poin_awal). Variabel sesi ini tersimpan selama koneksi aktif dan dapat diperiksa kapan saja menggunakan kueri SELECT @nama_variabel;.</w:t>
             </w:r>
           </w:p>
         </w:tc>
@@ -1374,7 +1752,7 @@
     <w:p>
       <w:pPr>
         <w:keepNext/>
-        <w:spacing w:before="160" w:after="40"/>
+        <w:spacing w:before="180" w:after="40"/>
       </w:pPr>
       <w:r>
         <w:rPr>
@@ -1383,7 +1761,7 @@
           <w:color w:val="234673"/>
           <w:sz w:val="21"/>
         </w:rPr>
-        <w:t>3.2 Contoh Implementasi Parameter IN, OUT, dan INOUT</w:t>
+        <w:t>5.1 Contoh Implementasi Parameter IN, OUT, dan INOUT</w:t>
       </w:r>
     </w:p>
     <w:tbl>
@@ -1426,7 +1804,7 @@
               <w:t>DELIMITER $$</w:t>
               <w:br/>
               <w:br/>
-              <w:t>-- Procedure dengan parameter IN dan OUT: Registrasi Member Baru &amp; Mengembalikan Kode Barunya</w:t>
+              <w:t>-- Procedure A: Parameter IN &amp; OUT (Registrasi Member &amp; Kembalikan ID Baru)</w:t>
               <w:br/>
               <w:t>CREATE PROCEDURE spRegistrasiMember(</w:t>
               <w:br/>
@@ -1450,7 +1828,7 @@
               <w:br/>
               <w:t xml:space="preserve">    </w:t>
               <w:br/>
-              <w:t xml:space="preserve">    -- Generate Kode Member Baru (Format M0001, M0002, dst)</w:t>
+              <w:t xml:space="preserve">    -- Hitung urutan nomor ID customer terakhir (Format M0001, M0002, dst)</w:t>
               <w:br/>
               <w:t xml:space="preserve">    SELECT IFNULL(MAX(CAST(RIGHT(kodecus, 4) AS UNSIGNED)), 0) INTO last_num FROM customer;</w:t>
               <w:br/>
@@ -1458,7 +1836,7 @@
               <w:br/>
               <w:t xml:space="preserve">    </w:t>
               <w:br/>
-              <w:t xml:space="preserve">    -- Simpan ke tabel fisik customer</w:t>
+              <w:t xml:space="preserve">    -- Simpan data fisik ke tabel customer</w:t>
               <w:br/>
               <w:t xml:space="preserve">    INSERT INTO customer (kodecus, namacus, tgllahir, jenkelcus, almtcus, hpcus, pointterkumpul)</w:t>
               <w:br/>
@@ -1467,7 +1845,7 @@
               <w:t>END$$</w:t>
               <w:br/>
               <w:br/>
-              <w:t>-- Procedure dengan parameter INOUT: Menghitung Tambahan Poin Bonus Transaksi</w:t>
+              <w:t>-- Procedure B: Parameter INOUT (Menghitung Tambahan Poin Loyalitas)</w:t>
               <w:br/>
               <w:t>CREATE PROCEDURE spHitungBonusLoyalitas(</w:t>
               <w:br/>
@@ -1508,7 +1886,7 @@
               <w:br/>
               <w:t>CALL spHitungBonusLoyalitas('VIP', @poin_awal);</w:t>
               <w:br/>
-              <w:t>SELECT @poin_awal AS 'Total Poin Setelah Bonus'; -- Output: 30</w:t>
+              <w:t>SELECT @poin_awal AS 'Total Poin Setelah Bonus VIP'; -- Output: 30 (10 masuk, bertambah 20, kembali 30)</w:t>
             </w:r>
           </w:p>
         </w:tc>
@@ -1522,7 +1900,7 @@
     <w:p>
       <w:pPr>
         <w:keepNext/>
-        <w:spacing w:before="260" w:after="60"/>
+        <w:spacing w:before="280" w:after="80"/>
       </w:pPr>
       <w:r>
         <w:rPr>
@@ -1531,7 +1909,7 @@
           <w:color w:val="14325F"/>
           <w:sz w:val="22"/>
         </w:rPr>
-        <w:t>4. KONTROL ALUR LOGIKA (CONTROL FLOW STATEMENTS)</w:t>
+        <w:t>6. KONTROL ALUR LOGIKA (CONTROL FLOW STATEMENTS)</w:t>
       </w:r>
     </w:p>
     <w:p>
@@ -1543,7 +1921,7 @@
           <w:rFonts w:ascii="Calibri" w:hAnsi="Calibri"/>
           <w:sz w:val="20"/>
         </w:rPr>
-        <w:t>MySQL menyediakan struktur kendali prosedural lengkap di dalam blok BEGIN-END:</w:t>
+        <w:t>Salah satu ciri pembeda mendasar antara Stored Routine dan View adalah keberadaan struktur kendali alur (Control Flow). Bagi mahasiswa yang sudah memahami dasar pemrograman (seperti Python, Java, atau C++), struktur ini memiliki logika yang identik, hanya saja tempat eksekusinya berada di dalam mesin database:</w:t>
       </w:r>
     </w:p>
     <w:p>
@@ -1567,14 +1945,14 @@
           <w:color w:val="1E1E1E"/>
           <w:sz w:val="20"/>
         </w:rPr>
-        <w:t xml:space="preserve">Pernyataan IF-THEN-ELSE: </w:t>
+        <w:t xml:space="preserve">1. Pernyataan IF-THEN-ELSEIF-ELSE: </w:t>
       </w:r>
       <w:r>
         <w:rPr>
           <w:rFonts w:ascii="Calibri" w:hAnsi="Calibri"/>
           <w:sz w:val="20"/>
         </w:rPr>
-        <w:t>Struktur percabangan bersyarat: IF kondisi THEN ... ELSEIF kondisi THEN ... ELSE ... END IF;</w:t>
+        <w:t>Percabangan bersyarat bertingkat: IF kondisi THEN ... ELSEIF kondisi THEN ... ELSE ... END IF;</w:t>
       </w:r>
     </w:p>
     <w:p>
@@ -1598,14 +1976,14 @@
           <w:color w:val="1E1E1E"/>
           <w:sz w:val="20"/>
         </w:rPr>
-        <w:t xml:space="preserve">Pernyataan CASE: </w:t>
+        <w:t xml:space="preserve">2. Pernyataan CASE: </w:t>
       </w:r>
       <w:r>
         <w:rPr>
           <w:rFonts w:ascii="Calibri" w:hAnsi="Calibri"/>
           <w:sz w:val="20"/>
         </w:rPr>
-        <w:t>Struktur percabangan bernilai jamak: CASE ekspresi WHEN nilai THEN ... ELSE ... END CASE;</w:t>
+        <w:t>Percabangan pembanding banyak nilai: CASE ekspresi WHEN nilai1 THEN ... WHEN nilai2 THEN ... ELSE ... END CASE;</w:t>
       </w:r>
     </w:p>
     <w:p>
@@ -1629,14 +2007,14 @@
           <w:color w:val="1E1E1E"/>
           <w:sz w:val="20"/>
         </w:rPr>
-        <w:t xml:space="preserve">Perulangan LOOP-LEAVE: </w:t>
+        <w:t xml:space="preserve">3. Perulangan WHILE-DO: </w:t>
       </w:r>
       <w:r>
         <w:rPr>
           <w:rFonts w:ascii="Calibri" w:hAnsi="Calibri"/>
           <w:sz w:val="20"/>
         </w:rPr>
-        <w:t>Perulangan tak terbatas yang dihentikan secara eksplisit menggunakan perintah LEAVE label_loop: [label:] LOOP ... IF kondisi THEN LEAVE [label]; END IF; END LOOP [label];</w:t>
+        <w:t>Perulangan dengan evaluasi kondisi di awal: WHILE kondisi DO ... instruksi ... END WHILE; (perulangan berhenti jika kondisi bernilai FALSE).</w:t>
       </w:r>
     </w:p>
     <w:p>
@@ -1660,14 +2038,14 @@
           <w:color w:val="1E1E1E"/>
           <w:sz w:val="20"/>
         </w:rPr>
-        <w:t xml:space="preserve">Perulangan WHILE-DO: </w:t>
+        <w:t xml:space="preserve">4. Perulangan REPEAT-UNTIL: </w:t>
       </w:r>
       <w:r>
         <w:rPr>
           <w:rFonts w:ascii="Calibri" w:hAnsi="Calibri"/>
           <w:sz w:val="20"/>
         </w:rPr>
-        <w:t>Perulangan dengan evaluasi kondisi di awal: WHILE kondisi DO ... END WHILE;</w:t>
+        <w:t>Perulangan dengan evaluasi kondisi di akhir: REPEAT ... instruksi ... UNTIL kondisi END REPEAT; (instruksi dijamin dieksekusi minimal satu kali).</w:t>
       </w:r>
     </w:p>
     <w:p>
@@ -1691,20 +2069,20 @@
           <w:color w:val="1E1E1E"/>
           <w:sz w:val="20"/>
         </w:rPr>
-        <w:t xml:space="preserve">Perulangan REPEAT-UNTIL: </w:t>
+        <w:t xml:space="preserve">5. Perulangan LOOP-LEAVE: </w:t>
       </w:r>
       <w:r>
         <w:rPr>
           <w:rFonts w:ascii="Calibri" w:hAnsi="Calibri"/>
           <w:sz w:val="20"/>
         </w:rPr>
-        <w:t>Perulangan dengan evaluasi kondisi di akhir: REPEAT ... UNTIL kondisi END REPEAT;</w:t>
+        <w:t>Perulangan tanpa henti yang dihentikan secara eksplisit menggunakan perintah LEAVE: [label:] LOOP ... IF kondisi THEN LEAVE [label]; END IF; END LOOP [label];</w:t>
       </w:r>
     </w:p>
     <w:p>
       <w:pPr>
         <w:keepNext/>
-        <w:spacing w:before="260" w:after="60"/>
+        <w:spacing w:before="280" w:after="80"/>
       </w:pPr>
       <w:r>
         <w:rPr>
@@ -1713,7 +2091,7 @@
           <w:color w:val="14325F"/>
           <w:sz w:val="22"/>
         </w:rPr>
-        <w:t>5. CURSOR &amp; ITERASI BARIS DATA DI MYSQL</w:t>
+        <w:t>7. CURSOR &amp; ITERASI DATA BARIS DEMI BARIS</w:t>
       </w:r>
     </w:p>
     <w:p>
@@ -1725,13 +2103,83 @@
           <w:rFonts w:ascii="Calibri" w:hAnsi="Calibri"/>
           <w:sz w:val="20"/>
         </w:rPr>
-        <w:t>Secara default, kueri SQL bekerja berbasis himpunan (set-based). Namun, ketika sistem membutuhkan evaluasi logika individual yang berbeda untuk setiap baris data, digunakan CURSOR. Cursor adalah penunjuk memori (pointer) yang menampung baris hasil kueri dan memungkinkan pembacaan data secara sekuensial baris per baris (*row-by-row navigation*).</w:t>
+        <w:t>Secara default, seluruh operasi kueri SQL bekerja berbasis himpunan (set-based). Contohnya, perintah 'UPDATE customer SET pointterkumpul = pointterkumpul + 10' akan memproses seluruh baris customer secara serentak dalam satu hentakan.</w:t>
+        <w:br/>
+        <w:t>Namun, bagaimana jika manajemen menginginkan aturan perhitungan yang berbeda-beda untuk tiap customer berdasarkan riwayat transaksi individual mereka? Di sinilah sistem basis data membutuhkan CURSOR.</w:t>
       </w:r>
+    </w:p>
+    <w:tbl>
+      <w:tblPr>
+        <w:tblW w:type="auto" w:w="0"/>
+        <w:jc w:val="center"/>
+        <w:tblLook w:firstColumn="1" w:firstRow="1" w:lastColumn="0" w:lastRow="0" w:noHBand="0" w:noVBand="1" w:val="04A0"/>
+      </w:tblPr>
+      <w:tblGrid>
+        <w:gridCol w:w="10080"/>
+      </w:tblGrid>
+      <w:tr>
+        <w:tc>
+          <w:tcPr>
+            <w:tcW w:type="dxa" w:w="10080"/>
+            <w:shd w:fill="F0F7FF"/>
+            <w:tcMar>
+              <w:top w:w="80" w:type="dxa"/>
+              <w:bottom w:w="80" w:type="dxa"/>
+              <w:left w:w="130" w:type="dxa"/>
+              <w:right w:w="130" w:type="dxa"/>
+            </w:tcMar>
+            <w:tcBorders>
+              <w:top w:val="single" w:sz="4" w:space="0" w:color="E2E8F0"/>
+              <w:left w:val="single" w:sz="20" w:space="0" w:color="1E40AF"/>
+              <w:bottom w:val="single" w:sz="4" w:space="0" w:color="E2E8F0"/>
+              <w:right w:val="single" w:sz="4" w:space="0" w:color="E2E8F0"/>
+            </w:tcBorders>
+          </w:tcPr>
+          <w:p>
+            <w:pPr>
+              <w:spacing w:before="0" w:after="0" w:line="276" w:lineRule="auto"/>
+            </w:pPr>
+            <w:r>
+              <w:rPr>
+                <w:rFonts w:ascii="Calibri" w:hAnsi="Calibri"/>
+                <w:b/>
+                <w:color w:val="1E40AF"/>
+                <w:sz w:val="19"/>
+              </w:rPr>
+              <w:t xml:space="preserve">💡 Analogi Membaca Daftar Absensi: </w:t>
+            </w:r>
+            <w:r>
+              <w:rPr>
+                <w:rFonts w:ascii="Calibri" w:hAnsi="Calibri"/>
+                <w:i/>
+                <w:color w:val="1E293B"/>
+                <w:sz w:val="19"/>
+              </w:rPr>
+              <w:t>Cursor ibarat dosen yang membaca lembar daftar absensi mahasiswa satu per satu:</w:t>
+              <w:br/>
+              <w:t>1. Dosen memegang lembaran daftar nama mahasiswa (DECLARE CURSOR FOR SELECT...).</w:t>
+              <w:br/>
+              <w:t>2. Menyiapkan penanda jika daftar sudah habis (DECLARE CONTINUE HANDLER FOR NOT FOUND...).</w:t>
+              <w:br/>
+              <w:t>3. Membuka lembaran absensi (OPEN curCustomer).</w:t>
+              <w:br/>
+              <w:t>4. Menunjuk nama pertama, membaca datanya (FETCH INTO), memutuskan aksi nilai, lalu berpindah ke nama berikutnya (LOOP).</w:t>
+              <w:br/>
+              <w:t>5. Begitu mencapai baris paling bawah, dosen selesai dan menutup map absensi (CLOSE curCustomer).</w:t>
+            </w:r>
+          </w:p>
+        </w:tc>
+      </w:tr>
+    </w:tbl>
+    <w:p>
+      <w:pPr>
+        <w:spacing w:before="40" w:after="60"/>
+      </w:pPr>
     </w:p>
     <w:p>
       <w:pPr>
         <w:keepNext/>
-        <w:spacing w:before="160" w:after="40"/>
+        <w:spacing w:before="180" w:after="40"/>
       </w:pPr>
       <w:r>
         <w:rPr>
@@ -1740,7 +2188,7 @@
           <w:color w:val="234673"/>
           <w:sz w:val="21"/>
         </w:rPr>
-        <w:t>5.1 Empat Siklus Hidup Cursor</w:t>
+        <w:t>7.1 Lima Siklus Wajib Implementasi Cursor</w:t>
       </w:r>
     </w:p>
     <w:p>
@@ -1771,7 +2219,7 @@
           <w:rFonts w:ascii="Calibri" w:hAnsi="Calibri"/>
           <w:sz w:val="20"/>
         </w:rPr>
-        <w:t>Mendefinisikan kueri SQL yang akan ditampung ke dalam kursor: DECLARE nama_cursor CURSOR FOR select_statement;</w:t>
+        <w:t>Mendefinisikan kueri SQL pembentuk baris yang akan dibaca: DECLARE cur CURSOR FOR SELECT kolom1, kolom2 FROM tabel;</w:t>
       </w:r>
     </w:p>
     <w:p>
@@ -1795,14 +2243,14 @@
           <w:color w:val="1E1E1E"/>
           <w:sz w:val="20"/>
         </w:rPr>
-        <w:t xml:space="preserve">2. DECLARE HANDLER: </w:t>
+        <w:t xml:space="preserve">2. DECLARE HANDLER NOT FOUND: </w:t>
       </w:r>
       <w:r>
         <w:rPr>
           <w:rFonts w:ascii="Calibri" w:hAnsi="Calibri"/>
           <w:sz w:val="20"/>
         </w:rPr>
-        <w:t>Mendaftarkan penangan kondisi ketika cursor telah mencapai baris terakhir: DECLARE CONTINUE HANDLER FOR NOT FOUND SET v_selesai = 1;</w:t>
+        <w:t>Mendaftarkan penangan kondisi ketika baris kursor telah habis: DECLARE CONTINUE HANDLER FOR NOT FOUND SET v_selesai = 1;</w:t>
       </w:r>
     </w:p>
     <w:p>
@@ -1826,14 +2274,14 @@
           <w:color w:val="1E1E1E"/>
           <w:sz w:val="20"/>
         </w:rPr>
-        <w:t xml:space="preserve">3. OPEN: </w:t>
+        <w:t xml:space="preserve">3. OPEN CURSOR: </w:t>
       </w:r>
       <w:r>
         <w:rPr>
           <w:rFonts w:ascii="Calibri" w:hAnsi="Calibri"/>
           <w:sz w:val="20"/>
         </w:rPr>
-        <w:t>Menginisialisasi memori dan mengeksekusi kueri pembentuk cursor: OPEN nama_cursor;</w:t>
+        <w:t>Mengalokasikan memori internal server dan mengeksekusi kueri kursor: OPEN cur;</w:t>
       </w:r>
     </w:p>
     <w:p>
@@ -1857,20 +2305,109 @@
           <w:color w:val="1E1E1E"/>
           <w:sz w:val="20"/>
         </w:rPr>
-        <w:t xml:space="preserve">4. FETCH &amp; CLOSE: </w:t>
+        <w:t xml:space="preserve">4. FETCH &amp; LOOP: </w:t>
       </w:r>
       <w:r>
         <w:rPr>
           <w:rFonts w:ascii="Calibri" w:hAnsi="Calibri"/>
           <w:sz w:val="20"/>
         </w:rPr>
-        <w:t>Mengambil nilai kolom pada baris aktif ke dalam variabel lokal: FETCH nama_cursor INTO var1, var2; dilanjutkan dengan penutupan memori: CLOSE nama_cursor;</w:t>
+        <w:t>Mengambil nilai kolom pada baris aktif ke dalam variabel lokal: FETCH cur INTO var1, var2; lalu keluar loop jika v_selesai = 1.</w:t>
       </w:r>
     </w:p>
     <w:p>
       <w:pPr>
+        <w:spacing w:after="60" w:line="269" w:lineRule="auto"/>
+        <w:ind w:left="360" w:hanging="259"/>
+      </w:pPr>
+      <w:r>
+        <w:rPr>
+          <w:rFonts w:ascii="Calibri" w:hAnsi="Calibri"/>
+          <w:b/>
+          <w:color w:val="28466E"/>
+          <w:sz w:val="20"/>
+        </w:rPr>
+        <w:t xml:space="preserve">• </w:t>
+      </w:r>
+      <w:r>
+        <w:rPr>
+          <w:rFonts w:ascii="Calibri" w:hAnsi="Calibri"/>
+          <w:b/>
+          <w:color w:val="1E1E1E"/>
+          <w:sz w:val="20"/>
+        </w:rPr>
+        <w:t xml:space="preserve">5. CLOSE CURSOR: </w:t>
+      </w:r>
+      <w:r>
+        <w:rPr>
+          <w:rFonts w:ascii="Calibri" w:hAnsi="Calibri"/>
+          <w:sz w:val="20"/>
+        </w:rPr>
+        <w:t>Membebaskan memori kerja kursor dari RAM server: CLOSE cur;</w:t>
+      </w:r>
+    </w:p>
+    <w:tbl>
+      <w:tblPr>
+        <w:tblW w:type="auto" w:w="0"/>
+        <w:jc w:val="center"/>
+        <w:tblLook w:firstColumn="1" w:firstRow="1" w:lastColumn="0" w:lastRow="0" w:noHBand="0" w:noVBand="1" w:val="04A0"/>
+      </w:tblPr>
+      <w:tblGrid>
+        <w:gridCol w:w="10080"/>
+      </w:tblGrid>
+      <w:tr>
+        <w:tc>
+          <w:tcPr>
+            <w:tcW w:type="dxa" w:w="10080"/>
+            <w:shd w:fill="FFFBEB"/>
+            <w:tcMar>
+              <w:top w:w="80" w:type="dxa"/>
+              <w:bottom w:w="80" w:type="dxa"/>
+              <w:left w:w="130" w:type="dxa"/>
+              <w:right w:w="130" w:type="dxa"/>
+            </w:tcMar>
+            <w:tcBorders>
+              <w:top w:val="single" w:sz="4" w:space="0" w:color="E2E8F0"/>
+              <w:left w:val="single" w:sz="20" w:space="0" w:color="D97706"/>
+              <w:bottom w:val="single" w:sz="4" w:space="0" w:color="E2E8F0"/>
+              <w:right w:val="single" w:sz="4" w:space="0" w:color="E2E8F0"/>
+            </w:tcBorders>
+          </w:tcPr>
+          <w:p>
+            <w:pPr>
+              <w:spacing w:before="0" w:after="0" w:line="276" w:lineRule="auto"/>
+            </w:pPr>
+            <w:r>
+              <w:rPr>
+                <w:rFonts w:ascii="Calibri" w:hAnsi="Calibri"/>
+                <w:b/>
+                <w:color w:val="B45309"/>
+                <w:sz w:val="19"/>
+              </w:rPr>
+              <w:t xml:space="preserve">⚠️ Catatan Kritis Kinerja (Performance Trade-off): </w:t>
+            </w:r>
+            <w:r>
+              <w:rPr>
+                <w:rFonts w:ascii="Calibri" w:hAnsi="Calibri"/>
+                <w:i/>
+                <w:color w:val="1E293B"/>
+                <w:sz w:val="19"/>
+              </w:rPr>
+              <w:t>Mengapa Cursor terasa lambat untuk dataset besar? Cursor memproses data secara sekuensial (row-by-row), sehingga memerlukan alokasi memori dan context-switching CPU per baris. Jika suatu transformasi data dapat diselesaikan menggunakan kueri set-based murni (seperti UPDATE dengan CASE-WHEN atau INSERT-SELECT), maka pendekatan set-based jauh lebih disarankan. Cursor digunakan hanya bila tiap baris memerlukan pemanggilan subrutin terpisah atau evaluasi prosedural bertingkat.</w:t>
+            </w:r>
+          </w:p>
+        </w:tc>
+      </w:tr>
+    </w:tbl>
+    <w:p>
+      <w:pPr>
+        <w:spacing w:before="40" w:after="60"/>
+      </w:pPr>
+    </w:p>
+    <w:p>
+      <w:pPr>
         <w:keepNext/>
-        <w:spacing w:before="160" w:after="40"/>
+        <w:spacing w:before="180" w:after="40"/>
       </w:pPr>
       <w:r>
         <w:rPr>
@@ -1879,7 +2416,7 @@
           <w:color w:val="234673"/>
           <w:sz w:val="21"/>
         </w:rPr>
-        <w:t>5.2 Contoh Nyata: Pembagian Bonus Poin Massal Customer (Modul 4 Halaman 17)</w:t>
+        <w:t>7.2 Contoh Nyata: Pembagian Bonus Poin Massal Customer</w:t>
       </w:r>
     </w:p>
     <w:tbl>
@@ -1946,7 +2483,7 @@
               <w:br/>
               <w:t xml:space="preserve">        </w:t>
               <w:br/>
-              <w:t xml:space="preserve">    -- 2. Deklarasi Handler NOT FOUND</w:t>
+              <w:t xml:space="preserve">    -- 2. Deklarasi Handler NOT FOUND (Dipicu saat FETCH sudah tidak menemukan baris lagi)</w:t>
               <w:br/>
               <w:t xml:space="preserve">    DECLARE CONTINUE HANDLER FOR NOT FOUND SET v_selesai = 1;</w:t>
               <w:br/>
@@ -1960,12 +2497,14 @@
               <w:br/>
               <w:t xml:space="preserve">    loopCustomer: LOOP</w:t>
               <w:br/>
-              <w:t xml:space="preserve">        -- 4. Mengambil baris data</w:t>
+              <w:t xml:space="preserve">        -- 4. Mengambil satu baris data ke dalam variabel</w:t>
               <w:br/>
               <w:t xml:space="preserve">        FETCH curCustomer INTO v_kodecus, v_poin_saat_ini;</w:t>
               <w:br/>
               <w:t xml:space="preserve">        </w:t>
               <w:br/>
+              <w:t xml:space="preserve">        -- Cek apakah data sudah habis</w:t>
+              <w:br/>
               <w:t xml:space="preserve">        IF v_selesai = 1 THEN</w:t>
               <w:br/>
               <w:t xml:space="preserve">            LEAVE loopCustomer;</w:t>
@@ -1974,7 +2513,7 @@
               <w:br/>
               <w:t xml:space="preserve">        </w:t>
               <w:br/>
-              <w:t xml:space="preserve">        -- Evaluasi Aturan Bisnis Bonus Poin</w:t>
+              <w:t xml:space="preserve">        -- Evaluasi aturan bisnis berjenjang per baris</w:t>
               <w:br/>
               <w:t xml:space="preserve">        IF v_poin_saat_ini &gt;= 100 THEN</w:t>
               <w:br/>
@@ -2012,7 +2551,7 @@
               <w:t>DELIMITER ;</w:t>
               <w:br/>
               <w:br/>
-              <w:t>-- Eksekusi:</w:t>
+              <w:t>-- Eksekusi Prosedur:</w:t>
               <w:br/>
               <w:t>CALL spProsesBonusPoinMassal();</w:t>
             </w:r>
@@ -2028,7 +2567,7 @@
     <w:p>
       <w:pPr>
         <w:keepNext/>
-        <w:spacing w:before="260" w:after="60"/>
+        <w:spacing w:before="280" w:after="80"/>
       </w:pPr>
       <w:r>
         <w:rPr>
@@ -2037,7 +2576,7 @@
           <w:color w:val="14325F"/>
           <w:sz w:val="22"/>
         </w:rPr>
-        <w:t>6. PENANGANAN GALAT &amp; INTEGRITAS TRANSAKSI (ERROR HANDLING)</w:t>
+        <w:t>8. PENANGANAN GALAT (ERROR HANDLING) &amp; INTEGRITAS TRANSAKSI ACID</w:t>
       </w:r>
     </w:p>
     <w:p>
@@ -2049,13 +2588,75 @@
           <w:rFonts w:ascii="Calibri" w:hAnsi="Calibri"/>
           <w:sz w:val="20"/>
         </w:rPr>
-        <w:t>Dalam aplikasi kasir tingkat produksi, kegagalan database engine tidak boleh menyebabkan data tidak konsisten (misal: uang kasir tercatat tetapi stok barang tidak berkurang). MySQL menyediakan sistem penanganan galat terstruktur:</w:t>
+        <w:t>Bayangkan skenario kasir toko ritel: Kasir sedang memproses belanja pelanggan. Stok produk di tabel PRODUK telah dipotong, namun tiba-tiba koneksi jaringan putus atau listrik mati sebelum nomor nota berhasil dicatat ke tabel NOTA. Tanpa penanganan galat dan kontrol transaksi yang tepat, basis data akan mengalami inkonsistensi parah: barang fisik toko berkurang tanpa adanya bukti riwayat transaksi penjualan.</w:t>
+        <w:br/>
+        <w:t>Untuk mencegah anomali tersebut, MySQL menyediakan mekanisme penanganan eksepsi terstruktur:</w:t>
       </w:r>
+    </w:p>
+    <w:tbl>
+      <w:tblPr>
+        <w:tblW w:type="auto" w:w="0"/>
+        <w:jc w:val="center"/>
+        <w:tblLook w:firstColumn="1" w:firstRow="1" w:lastColumn="0" w:lastRow="0" w:noHBand="0" w:noVBand="1" w:val="04A0"/>
+      </w:tblPr>
+      <w:tblGrid>
+        <w:gridCol w:w="10080"/>
+      </w:tblGrid>
+      <w:tr>
+        <w:tc>
+          <w:tcPr>
+            <w:tcW w:type="dxa" w:w="10080"/>
+            <w:shd w:fill="F0F7FF"/>
+            <w:tcMar>
+              <w:top w:w="80" w:type="dxa"/>
+              <w:bottom w:w="80" w:type="dxa"/>
+              <w:left w:w="130" w:type="dxa"/>
+              <w:right w:w="130" w:type="dxa"/>
+            </w:tcMar>
+            <w:tcBorders>
+              <w:top w:val="single" w:sz="4" w:space="0" w:color="E2E8F0"/>
+              <w:left w:val="single" w:sz="20" w:space="0" w:color="1E40AF"/>
+              <w:bottom w:val="single" w:sz="4" w:space="0" w:color="E2E8F0"/>
+              <w:right w:val="single" w:sz="4" w:space="0" w:color="E2E8F0"/>
+            </w:tcBorders>
+          </w:tcPr>
+          <w:p>
+            <w:pPr>
+              <w:spacing w:before="0" w:after="0" w:line="276" w:lineRule="auto"/>
+            </w:pPr>
+            <w:r>
+              <w:rPr>
+                <w:rFonts w:ascii="Calibri" w:hAnsi="Calibri"/>
+                <w:b/>
+                <w:color w:val="1E40AF"/>
+                <w:sz w:val="19"/>
+              </w:rPr>
+              <w:t xml:space="preserve">💡 Analogi Satpam Penjaga Toko &amp; Mesin ATM: </w:t>
+            </w:r>
+            <w:r>
+              <w:rPr>
+                <w:rFonts w:ascii="Calibri" w:hAnsi="Calibri"/>
+                <w:i/>
+                <w:color w:val="1E293B"/>
+                <w:sz w:val="19"/>
+              </w:rPr>
+              <w:t>• SIGNAL SQLSTATE '45000' ibarat SATPAM PENJAGA TOKO: Saat ada pembeli ingin membeli 5 barang padahal stok tersisa 2, satpam langsung menghentikan transaksi dan memberikan penjelasan yang jelas kepada pembeli: 'Transaksi ditolak: Stok tidak cukup!'. Kode '45000' adalah kode resmi internasional untuk kesalahan yang didefinisikan sendiri oleh pengguna (User-Defined Exception).</w:t>
+              <w:br/>
+              <w:t>• TRANSAKSI (START TRANSACTION, COMMIT, ROLLBACK) ibarat TRANSFER UANG DI ATM: Uang ditarik dari rekening pengirim DAN dimasukkan ke rekening penerima. Keduanya WAJIB berhasil bersama-sama (COMMIT). Jika mesin ATM macet di tengah jalan, seluruh proses dibatalkan dan saldo pengirim dikembalikan utuh (ROLLBACK). Tidak boleh ada kondisi setengah jalan.</w:t>
+            </w:r>
+          </w:p>
+        </w:tc>
+      </w:tr>
+    </w:tbl>
+    <w:p>
+      <w:pPr>
+        <w:spacing w:before="40" w:after="60"/>
+      </w:pPr>
     </w:p>
     <w:p>
       <w:pPr>
         <w:keepNext/>
-        <w:spacing w:before="160" w:after="40"/>
+        <w:spacing w:before="180" w:after="40"/>
       </w:pPr>
       <w:r>
         <w:rPr>
@@ -2064,84 +2665,7 @@
           <w:color w:val="234673"/>
           <w:sz w:val="21"/>
         </w:rPr>
-        <w:t>6.1 HANDLER &amp; SIGNAL SQLSTATE</w:t>
-      </w:r>
-    </w:p>
-    <w:p>
-      <w:pPr>
-        <w:spacing w:after="60" w:line="269" w:lineRule="auto"/>
-        <w:ind w:left="360" w:hanging="259"/>
-      </w:pPr>
-      <w:r>
-        <w:rPr>
-          <w:rFonts w:ascii="Calibri" w:hAnsi="Calibri"/>
-          <w:b/>
-          <w:color w:val="28466E"/>
-          <w:sz w:val="20"/>
-        </w:rPr>
-        <w:t xml:space="preserve">• </w:t>
-      </w:r>
-      <w:r>
-        <w:rPr>
-          <w:rFonts w:ascii="Calibri" w:hAnsi="Calibri"/>
-          <w:b/>
-          <w:color w:val="1E1E1E"/>
-          <w:sz w:val="20"/>
-        </w:rPr>
-        <w:t xml:space="preserve">DECLARE ... HANDLER: </w:t>
-      </w:r>
-      <w:r>
-        <w:rPr>
-          <w:rFonts w:ascii="Calibri" w:hAnsi="Calibri"/>
-          <w:sz w:val="20"/>
-        </w:rPr>
-        <w:t>Mendefinisikan aksi otomatis saat terjadi galat (SQLEXCEPTION) atau peringatan (SQLWARNING). Aksi dapat berupa CONTINUE (melanjutkan baris berikutnya) atau EXIT (segera menghentikan blok BEGIN-END saat itu).</w:t>
-      </w:r>
-    </w:p>
-    <w:p>
-      <w:pPr>
-        <w:spacing w:after="60" w:line="269" w:lineRule="auto"/>
-        <w:ind w:left="360" w:hanging="259"/>
-      </w:pPr>
-      <w:r>
-        <w:rPr>
-          <w:rFonts w:ascii="Calibri" w:hAnsi="Calibri"/>
-          <w:b/>
-          <w:color w:val="28466E"/>
-          <w:sz w:val="20"/>
-        </w:rPr>
-        <w:t xml:space="preserve">• </w:t>
-      </w:r>
-      <w:r>
-        <w:rPr>
-          <w:rFonts w:ascii="Calibri" w:hAnsi="Calibri"/>
-          <w:b/>
-          <w:color w:val="1E1E1E"/>
-          <w:sz w:val="20"/>
-        </w:rPr>
-        <w:t xml:space="preserve">SIGNAL SQLSTATE '45000': </w:t>
-      </w:r>
-      <w:r>
-        <w:rPr>
-          <w:rFonts w:ascii="Calibri" w:hAnsi="Calibri"/>
-          <w:sz w:val="20"/>
-        </w:rPr>
-        <w:t>Melempar pesan kesalahan kustom ke aplikasi klien. Kode SQLSTATE '45000' adalah kode standar yang dipesan untuk exception pengguna (User-Defined Unhandled Exception).</w:t>
-      </w:r>
-    </w:p>
-    <w:p>
-      <w:pPr>
-        <w:keepNext/>
-        <w:spacing w:before="160" w:after="40"/>
-      </w:pPr>
-      <w:r>
-        <w:rPr>
-          <w:rFonts w:ascii="Calibri" w:hAnsi="Calibri"/>
-          <w:b/>
-          <w:color w:val="234673"/>
-          <w:sz w:val="21"/>
-        </w:rPr>
-        <w:t>6.2 Contoh Implementasi: Validasi Stok &amp; Pembatalan Transaksi Kasir</w:t>
+        <w:t>8.1 Contoh Implementasi: Validasi Stok dengan SIGNAL SQLSTATE</w:t>
       </w:r>
     </w:p>
     <w:tbl>
@@ -2198,17 +2722,13 @@
               <w:br/>
               <w:t xml:space="preserve">    </w:t>
               <w:br/>
-              <w:t xml:space="preserve">    -- Mengambil stok barang saat ini</w:t>
-              <w:br/>
-              <w:t xml:space="preserve">    SELECT stok INTO v_stok_tersedia </w:t>
-              <w:br/>
-              <w:t xml:space="preserve">    FROM produk </w:t>
-              <w:br/>
-              <w:t xml:space="preserve">    WHERE kodeproduk = p_kodeproduk;</w:t>
+              <w:t xml:space="preserve">    -- Ambil persediaan stok barang saat ini</w:t>
+              <w:br/>
+              <w:t xml:space="preserve">    SELECT stok INTO v_stok_tersedia FROM produk WHERE kodeproduk = p_kodeproduk;</w:t>
               <w:br/>
               <w:t xml:space="preserve">    </w:t>
               <w:br/>
-              <w:t xml:space="preserve">    -- Validasi 1: Periksa apakah kode produk valid</w:t>
+              <w:t xml:space="preserve">    -- Validasi 1: Periksa apakah kode produk terdaftar</w:t>
               <w:br/>
               <w:t xml:space="preserve">    IF v_stok_tersedia IS NULL THEN</w:t>
               <w:br/>
@@ -2220,7 +2740,7 @@
               <w:br/>
               <w:t xml:space="preserve">    </w:t>
               <w:br/>
-              <w:t xml:space="preserve">    -- Validasi 2: Periksa kecukupan stok</w:t>
+              <w:t xml:space="preserve">    -- Validasi 2: Periksa kecukupan kuantitas stok</w:t>
               <w:br/>
               <w:t xml:space="preserve">    IF v_stok_tersedia &lt; p_qty THEN</w:t>
               <w:br/>
@@ -2230,13 +2750,9 @@
               <w:br/>
               <w:t xml:space="preserve">    ELSE</w:t>
               <w:br/>
-              <w:t xml:space="preserve">        -- Update stok fisik produk</w:t>
-              <w:br/>
-              <w:t xml:space="preserve">        UPDATE produk </w:t>
-              <w:br/>
-              <w:t xml:space="preserve">        SET stok = stok - p_qty </w:t>
-              <w:br/>
-              <w:t xml:space="preserve">        WHERE kodeproduk = p_kodeproduk;</w:t>
+              <w:t xml:space="preserve">        -- Update pemotongan stok fisik</w:t>
+              <w:br/>
+              <w:t xml:space="preserve">        UPDATE produk SET stok = stok - p_qty WHERE kodeproduk = p_kodeproduk;</w:t>
               <w:br/>
               <w:t xml:space="preserve">    END IF;</w:t>
               <w:br/>
@@ -2255,7 +2771,7 @@
               <w:br/>
               <w:t>CALL spKurangiStokBarang('P001', 9999);</w:t>
               <w:br/>
-              <w:t>-- Respon: ERROR 1644 (45000): Transaksi Dibatalkan: Stok produk di gudang tidak mencukupi.</w:t>
+              <w:t>-- Respon Konsol: ERROR 1644 (45000): Transaksi Dibatalkan: Stok produk di gudang tidak mencukupi.</w:t>
             </w:r>
           </w:p>
         </w:tc>
@@ -2269,7 +2785,7 @@
     <w:p>
       <w:pPr>
         <w:keepNext/>
-        <w:spacing w:before="260" w:after="60"/>
+        <w:spacing w:before="280" w:after="80"/>
       </w:pPr>
       <w:r>
         <w:rPr>
@@ -2278,7 +2794,7 @@
           <w:color w:val="14325F"/>
           <w:sz w:val="22"/>
         </w:rPr>
-        <w:t>7. STUDI KASUS: PROSEDUR TRANSAKSI CHECKOUT KASIR TERPADU</w:t>
+        <w:t>9. STUDI KASUS PENUTUP: PROSEDUR TRANSAKSI CHECKOUT KASIR TERPADU</w:t>
       </w:r>
     </w:p>
     <w:p>
@@ -2290,7 +2806,17 @@
           <w:rFonts w:ascii="Calibri" w:hAnsi="Calibri"/>
           <w:sz w:val="20"/>
         </w:rPr>
-        <w:t>Untuk mengintegrasikan seluruh materi (UDF, Stored Procedure, Parameter, dan Error Handling), berikut adalah prosedur transaksi checkout penjualan lengkap yang menghubungkan tabel KASIR, CUSTOMER, NOTA, ITEMNOTA, dan PRODUK:</w:t>
+        <w:t>Prosedur spCheckoutTransaksi di bawah ini berfungsi sebagai studi kasus terpadu tingkat enterprise. Prosedur ini menggabungkan seluruh konsep yang telah dipelajari sebelumnya ke dalam satu alur transaksi kasir nyata:</w:t>
+        <w:br/>
+        <w:t>• Memanggil UDF (fcGenerateNoNota dan fcHitungPoinBelanja)</w:t>
+        <w:br/>
+        <w:t>• Menggunakan parameter input (IN) dan parameter hasil keluaran (OUT)</w:t>
+        <w:br/>
+        <w:t>• Melakukan validasi integritas data dengan SIGNAL SQLSTATE '45000'</w:t>
+        <w:br/>
+        <w:t>• Membungkus mutasi multi-tabel dalam transaksi atomik (START TRANSACTION - COMMIT)</w:t>
+        <w:br/>
+        <w:t>• Menerapkan proteksi pembatalan otomatis dengan DECLARE EXIT HANDLER FOR SQLEXCEPTION (ROLLBACK).</w:t>
       </w:r>
     </w:p>
     <w:tbl>
@@ -2361,7 +2887,7 @@
               <w:br/>
               <w:t xml:space="preserve">    </w:t>
               <w:br/>
-              <w:t xml:space="preserve">    -- Tangani potensi kegagalan integritas dengan ROLLBACK</w:t>
+              <w:t xml:space="preserve">    -- Penanganan galat otomatis: Rollback semua mutasi tabel jika terjadi galat sistem</w:t>
               <w:br/>
               <w:t xml:space="preserve">    DECLARE EXIT HANDLER FOR SQLEXCEPTION</w:t>
               <w:br/>
@@ -2379,7 +2905,7 @@
               <w:br/>
               <w:t xml:space="preserve">    </w:t>
               <w:br/>
-              <w:t xml:space="preserve">    -- 1. Validasi Keberadaan Data Produk &amp; Stok</w:t>
+              <w:t xml:space="preserve">    -- 1. Validasi Keberadaan Data Produk &amp; Persediaan Stok</w:t>
               <w:br/>
               <w:t xml:space="preserve">    SELECT harga, stok INTO v_harga_satuan, v_stok_tersedia </w:t>
               <w:br/>
@@ -2403,7 +2929,7 @@
               <w:br/>
               <w:t xml:space="preserve">    </w:t>
               <w:br/>
-              <w:t xml:space="preserve">    -- 2. Generate Nomor Nota Baru secara otomatis</w:t>
+              <w:t xml:space="preserve">    -- 2. Kalkulasi Nilai &amp; Pemanggilan UDF</w:t>
               <w:br/>
               <w:t xml:space="preserve">    SET p_nonota_dihasilkan = fcGenerateNoNota(v_tgl_hari_ini);</w:t>
               <w:br/>
@@ -2413,11 +2939,11 @@
               <w:br/>
               <w:t xml:space="preserve">    </w:t>
               <w:br/>
-              <w:t xml:space="preserve">    -- 3. Memulai Transaksi Atomik</w:t>
+              <w:t xml:space="preserve">    -- 3. Memulai Blok Transaksi Atomik (ACID)</w:t>
               <w:br/>
               <w:t xml:space="preserve">    START TRANSACTION;</w:t>
               <w:br/>
-              <w:t xml:space="preserve">        -- Simpan Header Nota</w:t>
+              <w:t xml:space="preserve">        -- A. Simpan Header Nota Penjualan</w:t>
               <w:br/>
               <w:t xml:space="preserve">        INSERT INTO nota (nonota, kodekasir, tgltran, kodecus)</w:t>
               <w:br/>
@@ -2425,7 +2951,7 @@
               <w:br/>
               <w:t xml:space="preserve">        </w:t>
               <w:br/>
-              <w:t xml:space="preserve">        -- Simpan Detil Item Nota</w:t>
+              <w:t xml:space="preserve">        -- B. Simpan Rincian Item Transaksi</w:t>
               <w:br/>
               <w:t xml:space="preserve">        INSERT INTO itemnota (nonota, kodeproduk, banyak, hargajual)</w:t>
               <w:br/>
@@ -2433,13 +2959,13 @@
               <w:br/>
               <w:t xml:space="preserve">        </w:t>
               <w:br/>
-              <w:t xml:space="preserve">        -- Kurangi Stok Barang</w:t>
+              <w:t xml:space="preserve">        -- C. Kurangi Stok Fisik Produk</w:t>
               <w:br/>
               <w:t xml:space="preserve">        UPDATE produk SET stok = stok - p_banyak WHERE kodeproduk = p_kodeproduk;</w:t>
               <w:br/>
               <w:t xml:space="preserve">        </w:t>
               <w:br/>
-              <w:t xml:space="preserve">        -- Tambahkan Poin Belanja ke Member (Jika bukan customer umum M0000)</w:t>
+              <w:t xml:space="preserve">        -- D. Tambahkan Poin Belanja ke Akun Member (Kecuali customer umum M0000)</w:t>
               <w:br/>
               <w:t xml:space="preserve">        IF p_kodecus &lt;&gt; 'M0000' AND p_poin_baru &gt; 0 THEN</w:t>
               <w:br/>
@@ -2453,6 +2979,13 @@
               <w:br/>
               <w:br/>
               <w:t>DELIMITER ;</w:t>
+              <w:br/>
+              <w:br/>
+              <w:t>-- Pengujian Skenario Transaksi Kasir:</w:t>
+              <w:br/>
+              <w:t>CALL spCheckoutTransaksi('001', 'M0001', 'P001', 2, @nota, @total, @poin);</w:t>
+              <w:br/>
+              <w:t>SELECT @nota AS 'Nomor Nota', @total AS 'Total Bayar (Rp)', @poin AS 'Poin Diperoleh';</w:t>
             </w:r>
           </w:p>
         </w:tc>
@@ -2471,7 +3004,7 @@
     <w:p>
       <w:pPr>
         <w:keepNext/>
-        <w:spacing w:before="260" w:after="60"/>
+        <w:spacing w:before="280" w:after="80"/>
       </w:pPr>
       <w:r>
         <w:rPr>
@@ -2480,7 +3013,997 @@
           <w:color w:val="14325F"/>
           <w:sz w:val="22"/>
         </w:rPr>
-        <w:t>8. LEMBAR TUGAS &amp; LATIHAN SOAL PRAKTIKUM (UNTUK MAHASISWA)</w:t>
+        <w:t>10. PANDUAN PEDAGOGIS &amp; METODOLOGI MENGAJAR (KHUSUS DOSEN &amp; ASPRAK)</w:t>
+      </w:r>
+    </w:p>
+    <w:p>
+      <w:pPr>
+        <w:spacing w:after="80" w:line="276" w:lineRule="auto"/>
+      </w:pPr>
+      <w:r>
+        <w:rPr>
+          <w:rFonts w:ascii="Calibri" w:hAnsi="Calibri"/>
+          <w:sz w:val="20"/>
+        </w:rPr>
+        <w:t>Berdasarkan evaluasi pengajaran praktikum SMBD Lanjut di laboratorium, materi Stored Routine sering kali menjadi titik peralihan yang menantang bagi mahasiswa karena menggabungkan pemikiran aljabar relasional dengan pemikiran algoritma algoritmik. Berikut adalah 7 langkah urutan mengajar terstruktur yang disarankan:</w:t>
+      </w:r>
+    </w:p>
+    <w:p>
+      <w:pPr>
+        <w:spacing w:after="60" w:line="269" w:lineRule="auto"/>
+        <w:ind w:left="360" w:hanging="259"/>
+      </w:pPr>
+      <w:r>
+        <w:rPr>
+          <w:rFonts w:ascii="Calibri" w:hAnsi="Calibri"/>
+          <w:b/>
+          <w:color w:val="28466E"/>
+          <w:sz w:val="20"/>
+        </w:rPr>
+        <w:t xml:space="preserve">• </w:t>
+      </w:r>
+      <w:r>
+        <w:rPr>
+          <w:rFonts w:ascii="Calibri" w:hAnsi="Calibri"/>
+          <w:b/>
+          <w:color w:val="1E1E1E"/>
+          <w:sz w:val="20"/>
+        </w:rPr>
+        <w:t xml:space="preserve">Langkah 1: Jembatan Konseptual (View -&gt; Routine): </w:t>
+      </w:r>
+      <w:r>
+        <w:rPr>
+          <w:rFonts w:ascii="Calibri" w:hAnsi="Calibri"/>
+          <w:sz w:val="20"/>
+        </w:rPr>
+        <w:t>Mulai dengan menunjukkan perbedaan antara View (hanya satu SELECT yang diberi nama) dengan Stored Routine (program utuh yang memiliki logika di dalam basis data).</w:t>
+      </w:r>
+    </w:p>
+    <w:p>
+      <w:pPr>
+        <w:spacing w:after="60" w:line="269" w:lineRule="auto"/>
+        <w:ind w:left="360" w:hanging="259"/>
+      </w:pPr>
+      <w:r>
+        <w:rPr>
+          <w:rFonts w:ascii="Calibri" w:hAnsi="Calibri"/>
+          <w:b/>
+          <w:color w:val="28466E"/>
+          <w:sz w:val="20"/>
+        </w:rPr>
+        <w:t xml:space="preserve">• </w:t>
+      </w:r>
+      <w:r>
+        <w:rPr>
+          <w:rFonts w:ascii="Calibri" w:hAnsi="Calibri"/>
+          <w:b/>
+          <w:color w:val="1E1E1E"/>
+          <w:sz w:val="20"/>
+        </w:rPr>
+        <w:t xml:space="preserve">Langkah 2: Mulai dari Function (UDF): </w:t>
+      </w:r>
+      <w:r>
+        <w:rPr>
+          <w:rFonts w:ascii="Calibri" w:hAnsi="Calibri"/>
+          <w:sz w:val="20"/>
+        </w:rPr>
+        <w:t>Ajarkan Function terlebih dahulu karena konsepnya paling mirip dengan query SQL yang sudah dikenal mahasiswa (hasilnya langsung dapat dilihat di dalam SELECT).</w:t>
+      </w:r>
+    </w:p>
+    <w:p>
+      <w:pPr>
+        <w:spacing w:after="60" w:line="269" w:lineRule="auto"/>
+        <w:ind w:left="360" w:hanging="259"/>
+      </w:pPr>
+      <w:r>
+        <w:rPr>
+          <w:rFonts w:ascii="Calibri" w:hAnsi="Calibri"/>
+          <w:b/>
+          <w:color w:val="28466E"/>
+          <w:sz w:val="20"/>
+        </w:rPr>
+        <w:t xml:space="preserve">• </w:t>
+      </w:r>
+      <w:r>
+        <w:rPr>
+          <w:rFonts w:ascii="Calibri" w:hAnsi="Calibri"/>
+          <w:b/>
+          <w:color w:val="1E1E1E"/>
+          <w:sz w:val="20"/>
+        </w:rPr>
+        <w:t xml:space="preserve">Langkah 3: Tuntaskan Misteri DELIMITER: </w:t>
+      </w:r>
+      <w:r>
+        <w:rPr>
+          <w:rFonts w:ascii="Calibri" w:hAnsi="Calibri"/>
+          <w:sz w:val="20"/>
+        </w:rPr>
+        <w:t>Jelaskan alasan penggantian tanda akhir perintah menjadi '$$' saat mendemonstrasikan pembuatan Function pertama, agar mahasiswa tidak bingung dengan Syntax Error.</w:t>
+      </w:r>
+    </w:p>
+    <w:p>
+      <w:pPr>
+        <w:spacing w:after="60" w:line="269" w:lineRule="auto"/>
+        <w:ind w:left="360" w:hanging="259"/>
+      </w:pPr>
+      <w:r>
+        <w:rPr>
+          <w:rFonts w:ascii="Calibri" w:hAnsi="Calibri"/>
+          <w:b/>
+          <w:color w:val="28466E"/>
+          <w:sz w:val="20"/>
+        </w:rPr>
+        <w:t xml:space="preserve">• </w:t>
+      </w:r>
+      <w:r>
+        <w:rPr>
+          <w:rFonts w:ascii="Calibri" w:hAnsi="Calibri"/>
+          <w:b/>
+          <w:color w:val="1E1E1E"/>
+          <w:sz w:val="20"/>
+        </w:rPr>
+        <w:t xml:space="preserve">Langkah 4: Stored Procedure &amp; Parameter (IN, OUT, INOUT): </w:t>
+      </w:r>
+      <w:r>
+        <w:rPr>
+          <w:rFonts w:ascii="Calibri" w:hAnsi="Calibri"/>
+          <w:sz w:val="20"/>
+        </w:rPr>
+        <w:t>Gunakan analogi mesin fotokopi untuk membedakan aliran data parameter IN (dokumen asli), OUT (hasil fotokopi), dan INOUT (formulir yang dicoret-coret). Tekankan pentingnya tanda '@' untuk variabel sesi penampung.</w:t>
+      </w:r>
+    </w:p>
+    <w:p>
+      <w:pPr>
+        <w:spacing w:after="60" w:line="269" w:lineRule="auto"/>
+        <w:ind w:left="360" w:hanging="259"/>
+      </w:pPr>
+      <w:r>
+        <w:rPr>
+          <w:rFonts w:ascii="Calibri" w:hAnsi="Calibri"/>
+          <w:b/>
+          <w:color w:val="28466E"/>
+          <w:sz w:val="20"/>
+        </w:rPr>
+        <w:t xml:space="preserve">• </w:t>
+      </w:r>
+      <w:r>
+        <w:rPr>
+          <w:rFonts w:ascii="Calibri" w:hAnsi="Calibri"/>
+          <w:b/>
+          <w:color w:val="1E1E1E"/>
+          <w:sz w:val="20"/>
+        </w:rPr>
+        <w:t xml:space="preserve">Langkah 5: Struktur Kendali Logika (Control Flow): </w:t>
+      </w:r>
+      <w:r>
+        <w:rPr>
+          <w:rFonts w:ascii="Calibri" w:hAnsi="Calibri"/>
+          <w:sz w:val="20"/>
+        </w:rPr>
+        <w:t>Tunjukkan bahwa sintaks IF dan WHILE pada dasarnya sama seperti di bahasa pemrograman yang telah dipelajari mahasiswa (Python/Java), hanya berbeda tempat eksekusinya.</w:t>
+      </w:r>
+    </w:p>
+    <w:p>
+      <w:pPr>
+        <w:spacing w:after="60" w:line="269" w:lineRule="auto"/>
+        <w:ind w:left="360" w:hanging="259"/>
+      </w:pPr>
+      <w:r>
+        <w:rPr>
+          <w:rFonts w:ascii="Calibri" w:hAnsi="Calibri"/>
+          <w:b/>
+          <w:color w:val="28466E"/>
+          <w:sz w:val="20"/>
+        </w:rPr>
+        <w:t xml:space="preserve">• </w:t>
+      </w:r>
+      <w:r>
+        <w:rPr>
+          <w:rFonts w:ascii="Calibri" w:hAnsi="Calibri"/>
+          <w:b/>
+          <w:color w:val="1E1E1E"/>
+          <w:sz w:val="20"/>
+        </w:rPr>
+        <w:t xml:space="preserve">Langkah 6: Cursor &amp; Iterasi Baris Demi Baris: </w:t>
+      </w:r>
+      <w:r>
+        <w:rPr>
+          <w:rFonts w:ascii="Calibri" w:hAnsi="Calibri"/>
+          <w:sz w:val="20"/>
+        </w:rPr>
+        <w:t>Gunakan analogi membaca daftar absensi mahasiswa. Wajibkan mahasiswa menghafal 5 urutan mutlak: DECLARE CURSOR -&gt; DECLARE HANDLER NOT FOUND -&gt; OPEN -&gt; FETCH di LOOP -&gt; CLOSE. Jelaskan fungsi variabel bendera v_selesai.</w:t>
+      </w:r>
+    </w:p>
+    <w:p>
+      <w:pPr>
+        <w:spacing w:after="60" w:line="269" w:lineRule="auto"/>
+        <w:ind w:left="360" w:hanging="259"/>
+      </w:pPr>
+      <w:r>
+        <w:rPr>
+          <w:rFonts w:ascii="Calibri" w:hAnsi="Calibri"/>
+          <w:b/>
+          <w:color w:val="28466E"/>
+          <w:sz w:val="20"/>
+        </w:rPr>
+        <w:t xml:space="preserve">• </w:t>
+      </w:r>
+      <w:r>
+        <w:rPr>
+          <w:rFonts w:ascii="Calibri" w:hAnsi="Calibri"/>
+          <w:b/>
+          <w:color w:val="1E1E1E"/>
+          <w:sz w:val="20"/>
+        </w:rPr>
+        <w:t xml:space="preserve">Langkah 7: Error Handling &amp; Transaksi ACID: </w:t>
+      </w:r>
+      <w:r>
+        <w:rPr>
+          <w:rFonts w:ascii="Calibri" w:hAnsi="Calibri"/>
+          <w:sz w:val="20"/>
+        </w:rPr>
+        <w:t>Gunakan skenario listrik padam di kasir untuk menjelaskan mengapa transaksi atomik (START TRANSACTION - COMMIT/ROLLBACK) dan SIGNAL 45000 sangat penting untuk menjaga integritas data.</w:t>
+      </w:r>
+    </w:p>
+    <w:p>
+      <w:pPr>
+        <w:keepNext/>
+        <w:spacing w:before="280" w:after="80"/>
+      </w:pPr>
+      <w:r>
+        <w:rPr>
+          <w:rFonts w:ascii="Calibri" w:hAnsi="Calibri"/>
+          <w:b/>
+          <w:color w:val="14325F"/>
+          <w:sz w:val="22"/>
+        </w:rPr>
+        <w:t>11. GLOSARIUM &amp; RINGKASAN ISTILAH KUNCI</w:t>
+      </w:r>
+    </w:p>
+    <w:p>
+      <w:pPr>
+        <w:spacing w:after="80" w:line="276" w:lineRule="auto"/>
+      </w:pPr>
+      <w:r>
+        <w:rPr>
+          <w:rFonts w:ascii="Calibri" w:hAnsi="Calibri"/>
+          <w:sz w:val="20"/>
+        </w:rPr>
+        <w:t>Tabel referensi cepat istilah-istilah esensial untuk pegangan belajar praktikan dan evaluasi laboratorium:</w:t>
+      </w:r>
+    </w:p>
+    <w:tbl>
+      <w:tblPr>
+        <w:tblW w:type="auto" w:w="0"/>
+        <w:jc w:val="center"/>
+        <w:tblLook w:firstColumn="1" w:firstRow="1" w:lastColumn="0" w:lastRow="0" w:noHBand="0" w:noVBand="1" w:val="04A0"/>
+        <w:tblBorders>
+          <w:top w:val="single" w:sz="4" w:space="0" w:color="D0D7DE"/>
+          <w:bottom w:val="single" w:sz="4" w:space="0" w:color="D0D7DE"/>
+          <w:left w:val="none"/>
+          <w:right w:val="none"/>
+          <w:insideH w:val="single" w:sz="4" w:space="0" w:color="D0D7DE"/>
+          <w:insideV w:val="none"/>
+        </w:tblBorders>
+      </w:tblPr>
+      <w:tblGrid>
+        <w:gridCol w:w="5040"/>
+        <w:gridCol w:w="5040"/>
+      </w:tblGrid>
+      <w:tr>
+        <w:tc>
+          <w:tcPr>
+            <w:tcW w:type="dxa" w:w="3168"/>
+            <w:shd w:fill="1F3A60"/>
+            <w:tcMar>
+              <w:top w:w="100" w:type="dxa"/>
+              <w:bottom w:w="100" w:type="dxa"/>
+              <w:left w:w="120" w:type="dxa"/>
+              <w:right w:w="120" w:type="dxa"/>
+            </w:tcMar>
+          </w:tcPr>
+          <w:p>
+            <w:pPr>
+              <w:jc w:val="center"/>
+            </w:pPr>
+            <w:r>
+              <w:rPr>
+                <w:rFonts w:ascii="Calibri" w:hAnsi="Calibri"/>
+                <w:b/>
+                <w:color w:val="FFFFFF"/>
+                <w:sz w:val="18"/>
+              </w:rPr>
+              <w:t>Istilah / Perintah</w:t>
+            </w:r>
+          </w:p>
+        </w:tc>
+        <w:tc>
+          <w:tcPr>
+            <w:tcW w:type="dxa" w:w="6912"/>
+            <w:shd w:fill="1F3A60"/>
+            <w:tcMar>
+              <w:top w:w="100" w:type="dxa"/>
+              <w:bottom w:w="100" w:type="dxa"/>
+              <w:left w:w="120" w:type="dxa"/>
+              <w:right w:w="120" w:type="dxa"/>
+            </w:tcMar>
+          </w:tcPr>
+          <w:p>
+            <w:pPr>
+              <w:jc w:val="center"/>
+            </w:pPr>
+            <w:r>
+              <w:rPr>
+                <w:rFonts w:ascii="Calibri" w:hAnsi="Calibri"/>
+                <w:b/>
+                <w:color w:val="FFFFFF"/>
+                <w:sz w:val="18"/>
+              </w:rPr>
+              <w:t>Definisi Singkat &amp; Peran Teknis</w:t>
+            </w:r>
+          </w:p>
+        </w:tc>
+      </w:tr>
+      <w:tr>
+        <w:tc>
+          <w:tcPr>
+            <w:tcW w:type="dxa" w:w="3168"/>
+            <w:shd w:fill="FFFFFF"/>
+            <w:tcMar>
+              <w:top w:w="80" w:type="dxa"/>
+              <w:bottom w:w="80" w:type="dxa"/>
+              <w:left w:w="110" w:type="dxa"/>
+              <w:right w:w="110" w:type="dxa"/>
+            </w:tcMar>
+          </w:tcPr>
+          <w:p>
+            <w:pPr>
+              <w:spacing w:after="20" w:before="20" w:line="264" w:lineRule="auto"/>
+            </w:pPr>
+            <w:r>
+              <w:rPr>
+                <w:rFonts w:ascii="Calibri" w:hAnsi="Calibri"/>
+                <w:b/>
+                <w:color w:val="282828"/>
+                <w:sz w:val="17"/>
+              </w:rPr>
+              <w:t>Stored Routine</w:t>
+            </w:r>
+          </w:p>
+        </w:tc>
+        <w:tc>
+          <w:tcPr>
+            <w:tcW w:type="dxa" w:w="6912"/>
+            <w:shd w:fill="FFFFFF"/>
+            <w:tcMar>
+              <w:top w:w="80" w:type="dxa"/>
+              <w:bottom w:w="80" w:type="dxa"/>
+              <w:left w:w="110" w:type="dxa"/>
+              <w:right w:w="110" w:type="dxa"/>
+            </w:tcMar>
+          </w:tcPr>
+          <w:p>
+            <w:pPr>
+              <w:spacing w:after="20" w:before="20" w:line="264" w:lineRule="auto"/>
+            </w:pPr>
+            <w:r>
+              <w:rPr>
+                <w:rFonts w:ascii="Calibri" w:hAnsi="Calibri"/>
+                <w:color w:val="282828"/>
+                <w:sz w:val="17"/>
+              </w:rPr>
+              <w:t>Program prosedural berlogika yang disimpan permanen di dalam katalog basis data.</w:t>
+            </w:r>
+          </w:p>
+        </w:tc>
+      </w:tr>
+      <w:tr>
+        <w:tc>
+          <w:tcPr>
+            <w:tcW w:type="dxa" w:w="3168"/>
+            <w:shd w:fill="F8FAFC"/>
+            <w:tcMar>
+              <w:top w:w="80" w:type="dxa"/>
+              <w:bottom w:w="80" w:type="dxa"/>
+              <w:left w:w="110" w:type="dxa"/>
+              <w:right w:w="110" w:type="dxa"/>
+            </w:tcMar>
+          </w:tcPr>
+          <w:p>
+            <w:pPr>
+              <w:spacing w:after="20" w:before="20" w:line="264" w:lineRule="auto"/>
+            </w:pPr>
+            <w:r>
+              <w:rPr>
+                <w:rFonts w:ascii="Calibri" w:hAnsi="Calibri"/>
+                <w:b/>
+                <w:color w:val="282828"/>
+                <w:sz w:val="17"/>
+              </w:rPr>
+              <w:t>User Defined Function (UDF)</w:t>
+            </w:r>
+          </w:p>
+        </w:tc>
+        <w:tc>
+          <w:tcPr>
+            <w:tcW w:type="dxa" w:w="6912"/>
+            <w:shd w:fill="F8FAFC"/>
+            <w:tcMar>
+              <w:top w:w="80" w:type="dxa"/>
+              <w:bottom w:w="80" w:type="dxa"/>
+              <w:left w:w="110" w:type="dxa"/>
+              <w:right w:w="110" w:type="dxa"/>
+            </w:tcMar>
+          </w:tcPr>
+          <w:p>
+            <w:pPr>
+              <w:spacing w:after="20" w:before="20" w:line="264" w:lineRule="auto"/>
+            </w:pPr>
+            <w:r>
+              <w:rPr>
+                <w:rFonts w:ascii="Calibri" w:hAnsi="Calibri"/>
+                <w:color w:val="282828"/>
+                <w:sz w:val="17"/>
+              </w:rPr>
+              <w:t>Subrutin yang wajib mengembalikan satu nilai skalar via RETURN, dipanggil di dalam SELECT.</w:t>
+            </w:r>
+          </w:p>
+        </w:tc>
+      </w:tr>
+      <w:tr>
+        <w:tc>
+          <w:tcPr>
+            <w:tcW w:type="dxa" w:w="3168"/>
+            <w:shd w:fill="FFFFFF"/>
+            <w:tcMar>
+              <w:top w:w="80" w:type="dxa"/>
+              <w:bottom w:w="80" w:type="dxa"/>
+              <w:left w:w="110" w:type="dxa"/>
+              <w:right w:w="110" w:type="dxa"/>
+            </w:tcMar>
+          </w:tcPr>
+          <w:p>
+            <w:pPr>
+              <w:spacing w:after="20" w:before="20" w:line="264" w:lineRule="auto"/>
+            </w:pPr>
+            <w:r>
+              <w:rPr>
+                <w:rFonts w:ascii="Calibri" w:hAnsi="Calibri"/>
+                <w:b/>
+                <w:color w:val="282828"/>
+                <w:sz w:val="17"/>
+              </w:rPr>
+              <w:t>Stored Procedure</w:t>
+            </w:r>
+          </w:p>
+        </w:tc>
+        <w:tc>
+          <w:tcPr>
+            <w:tcW w:type="dxa" w:w="6912"/>
+            <w:shd w:fill="FFFFFF"/>
+            <w:tcMar>
+              <w:top w:w="80" w:type="dxa"/>
+              <w:bottom w:w="80" w:type="dxa"/>
+              <w:left w:w="110" w:type="dxa"/>
+              <w:right w:w="110" w:type="dxa"/>
+            </w:tcMar>
+          </w:tcPr>
+          <w:p>
+            <w:pPr>
+              <w:spacing w:after="20" w:before="20" w:line="264" w:lineRule="auto"/>
+            </w:pPr>
+            <w:r>
+              <w:rPr>
+                <w:rFonts w:ascii="Calibri" w:hAnsi="Calibri"/>
+                <w:color w:val="282828"/>
+                <w:sz w:val="17"/>
+              </w:rPr>
+              <w:t>Subrutin untuk mengerjakan alur tugas bisnis mandiri, dipanggil dengan perintah CALL.</w:t>
+            </w:r>
+          </w:p>
+        </w:tc>
+      </w:tr>
+      <w:tr>
+        <w:tc>
+          <w:tcPr>
+            <w:tcW w:type="dxa" w:w="3168"/>
+            <w:shd w:fill="F8FAFC"/>
+            <w:tcMar>
+              <w:top w:w="80" w:type="dxa"/>
+              <w:bottom w:w="80" w:type="dxa"/>
+              <w:left w:w="110" w:type="dxa"/>
+              <w:right w:w="110" w:type="dxa"/>
+            </w:tcMar>
+          </w:tcPr>
+          <w:p>
+            <w:pPr>
+              <w:spacing w:after="20" w:before="20" w:line="264" w:lineRule="auto"/>
+            </w:pPr>
+            <w:r>
+              <w:rPr>
+                <w:rFonts w:ascii="Calibri" w:hAnsi="Calibri"/>
+                <w:b/>
+                <w:color w:val="282828"/>
+                <w:sz w:val="17"/>
+              </w:rPr>
+              <w:t>DELIMITER $$</w:t>
+            </w:r>
+          </w:p>
+        </w:tc>
+        <w:tc>
+          <w:tcPr>
+            <w:tcW w:type="dxa" w:w="6912"/>
+            <w:shd w:fill="F8FAFC"/>
+            <w:tcMar>
+              <w:top w:w="80" w:type="dxa"/>
+              <w:bottom w:w="80" w:type="dxa"/>
+              <w:left w:w="110" w:type="dxa"/>
+              <w:right w:w="110" w:type="dxa"/>
+            </w:tcMar>
+          </w:tcPr>
+          <w:p>
+            <w:pPr>
+              <w:spacing w:after="20" w:before="20" w:line="264" w:lineRule="auto"/>
+            </w:pPr>
+            <w:r>
+              <w:rPr>
+                <w:rFonts w:ascii="Calibri" w:hAnsi="Calibri"/>
+                <w:color w:val="282828"/>
+                <w:sz w:val="17"/>
+              </w:rPr>
+              <w:t>Perintah untuk mengubah karakter penutup instruksi sementara agar titik-koma di blok BEGIN-END tidak memutus kueri.</w:t>
+            </w:r>
+          </w:p>
+        </w:tc>
+      </w:tr>
+      <w:tr>
+        <w:tc>
+          <w:tcPr>
+            <w:tcW w:type="dxa" w:w="3168"/>
+            <w:shd w:fill="FFFFFF"/>
+            <w:tcMar>
+              <w:top w:w="80" w:type="dxa"/>
+              <w:bottom w:w="80" w:type="dxa"/>
+              <w:left w:w="110" w:type="dxa"/>
+              <w:right w:w="110" w:type="dxa"/>
+            </w:tcMar>
+          </w:tcPr>
+          <w:p>
+            <w:pPr>
+              <w:spacing w:after="20" w:before="20" w:line="264" w:lineRule="auto"/>
+            </w:pPr>
+            <w:r>
+              <w:rPr>
+                <w:rFonts w:ascii="Calibri" w:hAnsi="Calibri"/>
+                <w:b/>
+                <w:color w:val="282828"/>
+                <w:sz w:val="17"/>
+              </w:rPr>
+              <w:t>Parameter IN</w:t>
+            </w:r>
+          </w:p>
+        </w:tc>
+        <w:tc>
+          <w:tcPr>
+            <w:tcW w:type="dxa" w:w="6912"/>
+            <w:shd w:fill="FFFFFF"/>
+            <w:tcMar>
+              <w:top w:w="80" w:type="dxa"/>
+              <w:bottom w:w="80" w:type="dxa"/>
+              <w:left w:w="110" w:type="dxa"/>
+              <w:right w:w="110" w:type="dxa"/>
+            </w:tcMar>
+          </w:tcPr>
+          <w:p>
+            <w:pPr>
+              <w:spacing w:after="20" w:before="20" w:line="264" w:lineRule="auto"/>
+            </w:pPr>
+            <w:r>
+              <w:rPr>
+                <w:rFonts w:ascii="Calibri" w:hAnsi="Calibri"/>
+                <w:color w:val="282828"/>
+                <w:sz w:val="17"/>
+              </w:rPr>
+              <w:t>Mode masukan nilai ke dalam procedure (default); procedure membaca nilai tanpa mengubah aslinya.</w:t>
+            </w:r>
+          </w:p>
+        </w:tc>
+      </w:tr>
+      <w:tr>
+        <w:tc>
+          <w:tcPr>
+            <w:tcW w:type="dxa" w:w="3168"/>
+            <w:shd w:fill="F8FAFC"/>
+            <w:tcMar>
+              <w:top w:w="80" w:type="dxa"/>
+              <w:bottom w:w="80" w:type="dxa"/>
+              <w:left w:w="110" w:type="dxa"/>
+              <w:right w:w="110" w:type="dxa"/>
+            </w:tcMar>
+          </w:tcPr>
+          <w:p>
+            <w:pPr>
+              <w:spacing w:after="20" w:before="20" w:line="264" w:lineRule="auto"/>
+            </w:pPr>
+            <w:r>
+              <w:rPr>
+                <w:rFonts w:ascii="Calibri" w:hAnsi="Calibri"/>
+                <w:b/>
+                <w:color w:val="282828"/>
+                <w:sz w:val="17"/>
+              </w:rPr>
+              <w:t>Parameter OUT</w:t>
+            </w:r>
+          </w:p>
+        </w:tc>
+        <w:tc>
+          <w:tcPr>
+            <w:tcW w:type="dxa" w:w="6912"/>
+            <w:shd w:fill="F8FAFC"/>
+            <w:tcMar>
+              <w:top w:w="80" w:type="dxa"/>
+              <w:bottom w:w="80" w:type="dxa"/>
+              <w:left w:w="110" w:type="dxa"/>
+              <w:right w:w="110" w:type="dxa"/>
+            </w:tcMar>
+          </w:tcPr>
+          <w:p>
+            <w:pPr>
+              <w:spacing w:after="20" w:before="20" w:line="264" w:lineRule="auto"/>
+            </w:pPr>
+            <w:r>
+              <w:rPr>
+                <w:rFonts w:ascii="Calibri" w:hAnsi="Calibri"/>
+                <w:color w:val="282828"/>
+                <w:sz w:val="17"/>
+              </w:rPr>
+              <w:t>Mode keluaran; procedure mengisi nilai hasil komputasi untuk diambil kembali oleh pemanggil.</w:t>
+            </w:r>
+          </w:p>
+        </w:tc>
+      </w:tr>
+      <w:tr>
+        <w:tc>
+          <w:tcPr>
+            <w:tcW w:type="dxa" w:w="3168"/>
+            <w:shd w:fill="FFFFFF"/>
+            <w:tcMar>
+              <w:top w:w="80" w:type="dxa"/>
+              <w:bottom w:w="80" w:type="dxa"/>
+              <w:left w:w="110" w:type="dxa"/>
+              <w:right w:w="110" w:type="dxa"/>
+            </w:tcMar>
+          </w:tcPr>
+          <w:p>
+            <w:pPr>
+              <w:spacing w:after="20" w:before="20" w:line="264" w:lineRule="auto"/>
+            </w:pPr>
+            <w:r>
+              <w:rPr>
+                <w:rFonts w:ascii="Calibri" w:hAnsi="Calibri"/>
+                <w:b/>
+                <w:color w:val="282828"/>
+                <w:sz w:val="17"/>
+              </w:rPr>
+              <w:t>Parameter INOUT</w:t>
+            </w:r>
+          </w:p>
+        </w:tc>
+        <w:tc>
+          <w:tcPr>
+            <w:tcW w:type="dxa" w:w="6912"/>
+            <w:shd w:fill="FFFFFF"/>
+            <w:tcMar>
+              <w:top w:w="80" w:type="dxa"/>
+              <w:bottom w:w="80" w:type="dxa"/>
+              <w:left w:w="110" w:type="dxa"/>
+              <w:right w:w="110" w:type="dxa"/>
+            </w:tcMar>
+          </w:tcPr>
+          <w:p>
+            <w:pPr>
+              <w:spacing w:after="20" w:before="20" w:line="264" w:lineRule="auto"/>
+            </w:pPr>
+            <w:r>
+              <w:rPr>
+                <w:rFonts w:ascii="Calibri" w:hAnsi="Calibri"/>
+                <w:color w:val="282828"/>
+                <w:sz w:val="17"/>
+              </w:rPr>
+              <w:t>Mode dua arah; membawa nilai awal masuk, diperbarui di dalam procedure, lalu dikembalikan.</w:t>
+            </w:r>
+          </w:p>
+        </w:tc>
+      </w:tr>
+      <w:tr>
+        <w:tc>
+          <w:tcPr>
+            <w:tcW w:type="dxa" w:w="3168"/>
+            <w:shd w:fill="F8FAFC"/>
+            <w:tcMar>
+              <w:top w:w="80" w:type="dxa"/>
+              <w:bottom w:w="80" w:type="dxa"/>
+              <w:left w:w="110" w:type="dxa"/>
+              <w:right w:w="110" w:type="dxa"/>
+            </w:tcMar>
+          </w:tcPr>
+          <w:p>
+            <w:pPr>
+              <w:spacing w:after="20" w:before="20" w:line="264" w:lineRule="auto"/>
+            </w:pPr>
+            <w:r>
+              <w:rPr>
+                <w:rFonts w:ascii="Calibri" w:hAnsi="Calibri"/>
+                <w:b/>
+                <w:color w:val="282828"/>
+                <w:sz w:val="17"/>
+              </w:rPr>
+              <w:t>Variabel Sesi (@variabel)</w:t>
+            </w:r>
+          </w:p>
+        </w:tc>
+        <w:tc>
+          <w:tcPr>
+            <w:tcW w:type="dxa" w:w="6912"/>
+            <w:shd w:fill="F8FAFC"/>
+            <w:tcMar>
+              <w:top w:w="80" w:type="dxa"/>
+              <w:bottom w:w="80" w:type="dxa"/>
+              <w:left w:w="110" w:type="dxa"/>
+              <w:right w:w="110" w:type="dxa"/>
+            </w:tcMar>
+          </w:tcPr>
+          <w:p>
+            <w:pPr>
+              <w:spacing w:after="20" w:before="20" w:line="264" w:lineRule="auto"/>
+            </w:pPr>
+            <w:r>
+              <w:rPr>
+                <w:rFonts w:ascii="Calibri" w:hAnsi="Calibri"/>
+                <w:color w:val="282828"/>
+                <w:sz w:val="17"/>
+              </w:rPr>
+              <w:t>Variabel tingkat koneksi pengguna di MySQL yang digunakan untuk menampung nilai parameter OUT/INOUT.</w:t>
+            </w:r>
+          </w:p>
+        </w:tc>
+      </w:tr>
+      <w:tr>
+        <w:tc>
+          <w:tcPr>
+            <w:tcW w:type="dxa" w:w="3168"/>
+            <w:shd w:fill="FFFFFF"/>
+            <w:tcMar>
+              <w:top w:w="80" w:type="dxa"/>
+              <w:bottom w:w="80" w:type="dxa"/>
+              <w:left w:w="110" w:type="dxa"/>
+              <w:right w:w="110" w:type="dxa"/>
+            </w:tcMar>
+          </w:tcPr>
+          <w:p>
+            <w:pPr>
+              <w:spacing w:after="20" w:before="20" w:line="264" w:lineRule="auto"/>
+            </w:pPr>
+            <w:r>
+              <w:rPr>
+                <w:rFonts w:ascii="Calibri" w:hAnsi="Calibri"/>
+                <w:b/>
+                <w:color w:val="282828"/>
+                <w:sz w:val="17"/>
+              </w:rPr>
+              <w:t>CURSOR</w:t>
+            </w:r>
+          </w:p>
+        </w:tc>
+        <w:tc>
+          <w:tcPr>
+            <w:tcW w:type="dxa" w:w="6912"/>
+            <w:shd w:fill="FFFFFF"/>
+            <w:tcMar>
+              <w:top w:w="80" w:type="dxa"/>
+              <w:bottom w:w="80" w:type="dxa"/>
+              <w:left w:w="110" w:type="dxa"/>
+              <w:right w:w="110" w:type="dxa"/>
+            </w:tcMar>
+          </w:tcPr>
+          <w:p>
+            <w:pPr>
+              <w:spacing w:after="20" w:before="20" w:line="264" w:lineRule="auto"/>
+            </w:pPr>
+            <w:r>
+              <w:rPr>
+                <w:rFonts w:ascii="Calibri" w:hAnsi="Calibri"/>
+                <w:color w:val="282828"/>
+                <w:sz w:val="17"/>
+              </w:rPr>
+              <w:t>Penunjuk memori internal untuk membaca dan memproses baris data hasil kueri satu per satu.</w:t>
+            </w:r>
+          </w:p>
+        </w:tc>
+      </w:tr>
+      <w:tr>
+        <w:tc>
+          <w:tcPr>
+            <w:tcW w:type="dxa" w:w="3168"/>
+            <w:shd w:fill="F8FAFC"/>
+            <w:tcMar>
+              <w:top w:w="80" w:type="dxa"/>
+              <w:bottom w:w="80" w:type="dxa"/>
+              <w:left w:w="110" w:type="dxa"/>
+              <w:right w:w="110" w:type="dxa"/>
+            </w:tcMar>
+          </w:tcPr>
+          <w:p>
+            <w:pPr>
+              <w:spacing w:after="20" w:before="20" w:line="264" w:lineRule="auto"/>
+            </w:pPr>
+            <w:r>
+              <w:rPr>
+                <w:rFonts w:ascii="Calibri" w:hAnsi="Calibri"/>
+                <w:b/>
+                <w:color w:val="282828"/>
+                <w:sz w:val="17"/>
+              </w:rPr>
+              <w:t>NOT FOUND Handler</w:t>
+            </w:r>
+          </w:p>
+        </w:tc>
+        <w:tc>
+          <w:tcPr>
+            <w:tcW w:type="dxa" w:w="6912"/>
+            <w:shd w:fill="F8FAFC"/>
+            <w:tcMar>
+              <w:top w:w="80" w:type="dxa"/>
+              <w:bottom w:w="80" w:type="dxa"/>
+              <w:left w:w="110" w:type="dxa"/>
+              <w:right w:w="110" w:type="dxa"/>
+            </w:tcMar>
+          </w:tcPr>
+          <w:p>
+            <w:pPr>
+              <w:spacing w:after="20" w:before="20" w:line="264" w:lineRule="auto"/>
+            </w:pPr>
+            <w:r>
+              <w:rPr>
+                <w:rFonts w:ascii="Calibri" w:hAnsi="Calibri"/>
+                <w:color w:val="282828"/>
+                <w:sz w:val="17"/>
+              </w:rPr>
+              <w:t>Penangan otomatis saat kursor mencapai baris terakhir (digunakan untuk memicu keluar loop).</w:t>
+            </w:r>
+          </w:p>
+        </w:tc>
+      </w:tr>
+      <w:tr>
+        <w:tc>
+          <w:tcPr>
+            <w:tcW w:type="dxa" w:w="3168"/>
+            <w:shd w:fill="FFFFFF"/>
+            <w:tcMar>
+              <w:top w:w="80" w:type="dxa"/>
+              <w:bottom w:w="80" w:type="dxa"/>
+              <w:left w:w="110" w:type="dxa"/>
+              <w:right w:w="110" w:type="dxa"/>
+            </w:tcMar>
+          </w:tcPr>
+          <w:p>
+            <w:pPr>
+              <w:spacing w:after="20" w:before="20" w:line="264" w:lineRule="auto"/>
+            </w:pPr>
+            <w:r>
+              <w:rPr>
+                <w:rFonts w:ascii="Calibri" w:hAnsi="Calibri"/>
+                <w:b/>
+                <w:color w:val="282828"/>
+                <w:sz w:val="17"/>
+              </w:rPr>
+              <w:t>SIGNAL SQLSTATE '45000'</w:t>
+            </w:r>
+          </w:p>
+        </w:tc>
+        <w:tc>
+          <w:tcPr>
+            <w:tcW w:type="dxa" w:w="6912"/>
+            <w:shd w:fill="FFFFFF"/>
+            <w:tcMar>
+              <w:top w:w="80" w:type="dxa"/>
+              <w:bottom w:w="80" w:type="dxa"/>
+              <w:left w:w="110" w:type="dxa"/>
+              <w:right w:w="110" w:type="dxa"/>
+            </w:tcMar>
+          </w:tcPr>
+          <w:p>
+            <w:pPr>
+              <w:spacing w:after="20" w:before="20" w:line="264" w:lineRule="auto"/>
+            </w:pPr>
+            <w:r>
+              <w:rPr>
+                <w:rFonts w:ascii="Calibri" w:hAnsi="Calibri"/>
+                <w:color w:val="282828"/>
+                <w:sz w:val="17"/>
+              </w:rPr>
+              <w:t>Perintah untuk melempar pesan kesalahan kustom buatan pengguna ke aplikasi klien.</w:t>
+            </w:r>
+          </w:p>
+        </w:tc>
+      </w:tr>
+      <w:tr>
+        <w:tc>
+          <w:tcPr>
+            <w:tcW w:type="dxa" w:w="3168"/>
+            <w:shd w:fill="F8FAFC"/>
+            <w:tcMar>
+              <w:top w:w="80" w:type="dxa"/>
+              <w:bottom w:w="80" w:type="dxa"/>
+              <w:left w:w="110" w:type="dxa"/>
+              <w:right w:w="110" w:type="dxa"/>
+            </w:tcMar>
+          </w:tcPr>
+          <w:p>
+            <w:pPr>
+              <w:spacing w:after="20" w:before="20" w:line="264" w:lineRule="auto"/>
+            </w:pPr>
+            <w:r>
+              <w:rPr>
+                <w:rFonts w:ascii="Calibri" w:hAnsi="Calibri"/>
+                <w:b/>
+                <w:color w:val="282828"/>
+                <w:sz w:val="17"/>
+              </w:rPr>
+              <w:t>Transaksi ACID</w:t>
+            </w:r>
+          </w:p>
+        </w:tc>
+        <w:tc>
+          <w:tcPr>
+            <w:tcW w:type="dxa" w:w="6912"/>
+            <w:shd w:fill="F8FAFC"/>
+            <w:tcMar>
+              <w:top w:w="80" w:type="dxa"/>
+              <w:bottom w:w="80" w:type="dxa"/>
+              <w:left w:w="110" w:type="dxa"/>
+              <w:right w:w="110" w:type="dxa"/>
+            </w:tcMar>
+          </w:tcPr>
+          <w:p>
+            <w:pPr>
+              <w:spacing w:after="20" w:before="20" w:line="264" w:lineRule="auto"/>
+            </w:pPr>
+            <w:r>
+              <w:rPr>
+                <w:rFonts w:ascii="Calibri" w:hAnsi="Calibri"/>
+                <w:color w:val="282828"/>
+                <w:sz w:val="17"/>
+              </w:rPr>
+              <w:t>Jaminan atomisitas bahwa seluruh perubahan multi-tabel berhasil bersama (COMMIT) atau batal bersama (ROLLBACK).</w:t>
+            </w:r>
+          </w:p>
+        </w:tc>
+      </w:tr>
+    </w:tbl>
+    <w:p>
+      <w:pPr>
+        <w:spacing w:before="40" w:after="60"/>
+      </w:pPr>
+    </w:p>
+    <w:p>
+      <w:r>
+        <w:br w:type="page"/>
+      </w:r>
+    </w:p>
+    <w:p>
+      <w:pPr>
+        <w:keepNext/>
+        <w:spacing w:before="280" w:after="80"/>
+      </w:pPr>
+      <w:r>
+        <w:rPr>
+          <w:rFonts w:ascii="Calibri" w:hAnsi="Calibri"/>
+          <w:b/>
+          <w:color w:val="14325F"/>
+          <w:sz w:val="22"/>
+        </w:rPr>
+        <w:t>12. LEMBAR TUGAS &amp; LATIHAN SOAL PRAKTIKUM (UNTUK MAHASISWA)</w:t>
       </w:r>
     </w:p>
     <w:p>
@@ -2494,19 +4017,19 @@
         </w:rPr>
         <w:t>Petunjuk Pengerjaan Mahasiswa / Praktikan:</w:t>
         <w:br/>
-        <w:t>1. Pastikan basis data minimarket praktikum (PRODUK, KASIR, CUSTOMER, NOTA, ITEMNOTA) telah aktif.</w:t>
+        <w:t>1. Pastikan skema basis data minimarket praktikum (PRODUK, KASIR, CUSTOMER, NOTA, ITEMNOTA) telah diimpor dan aktif.</w:t>
         <w:br/>
-        <w:t>2. Tuliskan kueri pembuatan Function / Procedure lengkap dengan penyesuaian DELIMITER.</w:t>
+        <w:t>2. Tuliskan kueri pembuatan Function atau Procedure secara lengkap dengan penyesuaian DELIMITER.</w:t>
         <w:br/>
-        <w:t>3. Lakukan pengujian eksekusi (CALL / SELECT) dan tangkap layar (screenshot) kode kueri serta output terminal.</w:t>
+        <w:t>3. Lakukan pengujian eksekusi (CALL atau SELECT) dan tangkap layar (screenshot) kode kueri serta respon output terminal.</w:t>
         <w:br/>
-        <w:t>4. Perhatikan penggunaan tipe parameter (IN, OUT, INOUT) dan penanganan kondisi error sesuai instruksi soal.</w:t>
+        <w:t>4. Perhatikan mode parameter (IN, OUT, INOUT) dan penanganan kondisi error batas (seperti nilai NULL atau stok 0).</w:t>
       </w:r>
     </w:p>
     <w:p>
       <w:pPr>
         <w:keepNext/>
-        <w:spacing w:before="160" w:after="40"/>
+        <w:spacing w:before="180" w:after="40"/>
       </w:pPr>
       <w:r>
         <w:rPr>
@@ -2536,7 +4059,7 @@
           <w:rFonts w:ascii="Calibri" w:hAnsi="Calibri"/>
           <w:sz w:val="20"/>
         </w:rPr>
-        <w:t>Buatlah UDF bernama 'fcCekStatusStok' yang menerima input parameter 'p_kodeproduk' (CHAR(4)) dan mengembalikan nilai skalar string (VARCHAR(20)). Ketentuan: jika stok = 0 kembalikan 'KOSONG', jika stok 1 s.d. 5 kembalikan 'KRITIS', selain itu kembalikan 'TERSEDIA (X Unit)'. Uji function ini menggunakan kueri SELECT pada tabel produk.</w:t>
+        <w:t>Buatlah UDF bernama 'fcCekStatusStok' yang menerima parameter 'p_kodeproduk' (CHAR(4)) dan mengembalikan status stok (VARCHAR(30)). Ketentuan: jika stok = 0 kembalikan 'KOSONG', jika stok 1 s.d. 5 kembalikan 'KRITIS', jika lebih dari 5 kembalikan 'TERSEDIA (X Unit)', dan jika kode produk tidak ada kembalikan 'PRODUK TIDAK ADA'. Uji dengan menampilkan daftar produk dan status stoknya.</w:t>
       </w:r>
     </w:p>
     <w:p>
@@ -2557,7 +4080,7 @@
           <w:rFonts w:ascii="Calibri" w:hAnsi="Calibri"/>
           <w:sz w:val="20"/>
         </w:rPr>
-        <w:t>Toko ingin mengklasifikasikan jenjang keanggotaan pelanggan. Buatlah UDF bernama 'fcLevelLoyalitas' yang menerima input 'p_point' (INT) dan mengembalikan status (VARCHAR(15)) dengan kriteria: Point &gt;= 100 'PLATINUM', Point 50-99 'GOLD', Point 20-49 'SILVER', dan Point &lt; 20 'BRONZE'. Tampilkan daftar nama customer beserta level loyalitasnya menggunakan fungsi ini.</w:t>
+        <w:t>Toko ingin mengklasifikasikan jenjang keanggotaan pelanggan berdasarkan perolehan poin. Buatlah UDF bernama 'fcLevelLoyalitas' yang menerima input 'p_point' (INT) dan mengembalikan string status loyalitas: Point &gt;= 100 'PLATINUM', Point 50 s.d. 99 'GOLD', Point 20 s.d. 49 'SILVER', dan Point &lt; 20 'BRONZE'. Tampilkan seluruh data pelanggan beserta tier loyalitasnya menggunakan fungsi ini.</w:t>
       </w:r>
     </w:p>
     <w:p>
@@ -2578,13 +4101,13 @@
           <w:rFonts w:ascii="Calibri" w:hAnsi="Calibri"/>
           <w:sz w:val="20"/>
         </w:rPr>
-        <w:t>Buatlah UDF bernama 'fcFormatRupiah' yang menerima input nominal angka (INT) dan mengembalikan string berformat mata uang Indonesia dengan awalan 'Rp. ' dan pemisah ribuan titik (contoh: 15000 menjadi 'Rp. 15.000'). Uji dengan menampilkan daftar harga produk.</w:t>
+        <w:t>Buatlah UDF bernama 'fcFormatRupiah' yang menerima input nominal angka (INT) dan mengembalikan string berformat mata uang Indonesia dengan awalan 'Rp. ' dan pemisah ribuan titik (contoh: angka 15000 menjadi string 'Rp. 15.000'). Uji dengan menampilkan harga produk.</w:t>
       </w:r>
     </w:p>
     <w:p>
       <w:pPr>
         <w:keepNext/>
-        <w:spacing w:before="160" w:after="40"/>
+        <w:spacing w:before="180" w:after="40"/>
       </w:pPr>
       <w:r>
         <w:rPr>
@@ -2614,7 +4137,7 @@
           <w:rFonts w:ascii="Calibri" w:hAnsi="Calibri"/>
           <w:sz w:val="20"/>
         </w:rPr>
-        <w:t>Buatlah Stored Procedure bernama 'spCariDataCustomer' dengan satu parameter IN (p_kodecus CHAR(5)) dan tiga parameter OUT (p_nama VARCHAR(50), p_alamat VARCHAR(100), p_poin INT). Procedure bertugas mencari data customer bersangkutan dan menyimpan nilainya ke ketiga parameter OUT. Tulis kueri pemanggilan dan periksa variabel outputnya.</w:t>
+        <w:t>Buatlah Stored Procedure bernama 'spCariDataCustomer' dengan satu parameter IN (p_kodecus CHAR(5)) dan tiga parameter OUT (p_nama VARCHAR(50), p_alamat VARCHAR(100), p_poin INT). Procedure mencari customer bersangkutan dan menyimpan nilainya ke ketiga parameter OUT. Tuliskan kueri pemanggilan dengan CALL dan tampilkan isi variabel penampungnya.</w:t>
       </w:r>
     </w:p>
     <w:p>
@@ -2662,7 +4185,7 @@
     <w:p>
       <w:pPr>
         <w:keepNext/>
-        <w:spacing w:before="160" w:after="40"/>
+        <w:spacing w:before="180" w:after="40"/>
       </w:pPr>
       <w:r>
         <w:rPr>
@@ -2719,7 +4242,7 @@
     <w:p>
       <w:pPr>
         <w:keepNext/>
-        <w:spacing w:before="160" w:after="40"/>
+        <w:spacing w:before="180" w:after="40"/>
       </w:pPr>
       <w:r>
         <w:rPr>
@@ -2781,7 +4304,7 @@
     <w:p>
       <w:pPr>
         <w:keepNext/>
-        <w:spacing w:before="260" w:after="60"/>
+        <w:spacing w:before="280" w:after="80"/>
       </w:pPr>
       <w:r>
         <w:rPr>
@@ -2790,7 +4313,7 @@
           <w:color w:val="14325F"/>
           <w:sz w:val="22"/>
         </w:rPr>
-        <w:t>9. LAMPIRAN: KUNCI JAWABAN &amp; PEMBAHASAN LENGKAP (KHUSUS DOSEN &amp; ASISTEN PRAKTIKUM)</w:t>
+        <w:t>13. LAMPIRAN: KUNCI JAWABAN &amp; PEMBAHASAN LENGKAP (KHUSUS DOSEN &amp; ASISTEN PRAKTIKUM)</w:t>
       </w:r>
     </w:p>
     <w:p>
@@ -2802,13 +4325,13 @@
           <w:rFonts w:ascii="Calibri" w:hAnsi="Calibri"/>
           <w:sz w:val="20"/>
         </w:rPr>
-        <w:t>Bagian ini memuat seluruh solusi kueri SQL baku, sintaks pengujian eksekusi, serta analisis logika teknis untuk instrumen evaluasi penilaian asisten praktikum:</w:t>
+        <w:t>Bagian ini memuat seluruh solusi kueri SQL baku, sintaks pengujian eksekusi, serta analisis logika teknis sebagai pedoman evaluasi dan rubrik penilaian bagi dosen dan asisten praktikum:</w:t>
       </w:r>
     </w:p>
     <w:p>
       <w:pPr>
         <w:keepNext/>
-        <w:spacing w:before="160" w:after="40"/>
+        <w:spacing w:before="180" w:after="40"/>
       </w:pPr>
       <w:r>
         <w:rPr>
@@ -2937,13 +4460,13 @@
           <w:rFonts w:ascii="Calibri" w:hAnsi="Calibri"/>
           <w:sz w:val="20"/>
         </w:rPr>
-        <w:t>Analisis: Fungsi membaca data stok dari tabel produk dan mengevaluasi ambang batas menggunakan struktur IF-ELSEIF.</w:t>
+        <w:t>Analisis: Fungsi membaca data stok dari tabel produk dan mengevaluasi ambang batas menggunakan struktur IF-ELSEIF secara deterministik.</w:t>
       </w:r>
     </w:p>
     <w:p>
       <w:pPr>
         <w:keepNext/>
-        <w:spacing w:before="160" w:after="40"/>
+        <w:spacing w:before="180" w:after="40"/>
       </w:pPr>
       <w:r>
         <w:rPr>
@@ -3062,13 +4585,13 @@
           <w:rFonts w:ascii="Calibri" w:hAnsi="Calibri"/>
           <w:sz w:val="20"/>
         </w:rPr>
-        <w:t>Analisis: Menggunakan karakteristik NO SQL karena murni komputasi skalar tanpa mengakses tabel.</w:t>
+        <w:t>Analisis: Menggunakan karakteristik NO SQL karena murni komputasi skalar tanpa mengakses data tabel fisik.</w:t>
       </w:r>
     </w:p>
     <w:p>
       <w:pPr>
         <w:keepNext/>
-        <w:spacing w:before="160" w:after="40"/>
+        <w:spacing w:before="180" w:after="40"/>
       </w:pPr>
       <w:r>
         <w:rPr>
@@ -3173,7 +4696,7 @@
     <w:p>
       <w:pPr>
         <w:keepNext/>
-        <w:spacing w:before="160" w:after="40"/>
+        <w:spacing w:before="180" w:after="40"/>
       </w:pPr>
       <w:r>
         <w:rPr>
@@ -3242,7 +4765,7 @@
               <w:br/>
               <w:t xml:space="preserve">    INTO p_nama, p_alamat, p_poin</w:t>
               <w:br/>
-              <w:t xml:space="preserve">    FROM customer</w:t>
+              <w:t xml:space="preserve">    FROM customer </w:t>
               <w:br/>
               <w:t xml:space="preserve">    WHERE kodecus = p_kodecus;</w:t>
               <w:br/>
@@ -3255,7 +4778,7 @@
               <w:br/>
               <w:t>CALL spCariDataCustomer('M0001', @nama, @alamat, @poin);</w:t>
               <w:br/>
-              <w:t>SELECT @nama AS Nama, @alamat AS Alamat, @poin AS Poin;</w:t>
+              <w:t>SELECT @nama AS 'Nama', @alamat AS 'Alamat', @poin AS 'Poin Terkumpul';</w:t>
             </w:r>
           </w:p>
         </w:tc>
@@ -3284,13 +4807,13 @@
           <w:rFonts w:ascii="Calibri" w:hAnsi="Calibri"/>
           <w:sz w:val="20"/>
         </w:rPr>
-        <w:t>Analisis: Klausa SELECT INTO memetakan kolom baris kueri secara langsung ke dalam parameter OUT.</w:t>
+        <w:t>Analisis: Menggunakan SELECT INTO untuk menampung data baris tunggal ke dalam variabel parameter bertipe OUT.</w:t>
       </w:r>
     </w:p>
     <w:p>
       <w:pPr>
         <w:keepNext/>
-        <w:spacing w:before="160" w:after="40"/>
+        <w:spacing w:before="180" w:after="40"/>
       </w:pPr>
       <w:r>
         <w:rPr>
@@ -3353,11 +4876,11 @@
               <w:br/>
               <w:t xml:space="preserve">    -- Potong harga sebesar 10%</w:t>
               <w:br/>
-              <w:t xml:space="preserve">    SET p_harga = ROUND(p_harga * 0.90);</w:t>
+              <w:t xml:space="preserve">    SET p_harga = p_harga * 0.90;</w:t>
               <w:br/>
               <w:t xml:space="preserve">    </w:t>
               <w:br/>
-              <w:t xml:space="preserve">    -- Update ke tabel fisik produk</w:t>
+              <w:t xml:space="preserve">    -- Perbarui harga di tabel master produk</w:t>
               <w:br/>
               <w:t xml:space="preserve">    UPDATE produk SET harga = p_harga WHERE kodeproduk = p_kodeproduk;</w:t>
               <w:br/>
@@ -3368,11 +4891,11 @@
               <w:br/>
               <w:t>-- Kueri Pengujian:</w:t>
               <w:br/>
-              <w:t>SET @harga_awal = 10000;</w:t>
-              <w:br/>
-              <w:t>CALL spTerapkanDiskonProduk('P001', @harga_awal);</w:t>
-              <w:br/>
-              <w:t>SELECT @harga_awal AS harga_setelah_diskon;</w:t>
+              <w:t>SET @harga_produk = 10000;</w:t>
+              <w:br/>
+              <w:t>CALL spTerapkanDiskonProduk('P001', @harga_produk);</w:t>
+              <w:br/>
+              <w:t>SELECT @harga_produk AS 'Harga Baru Setelah Diskon 10%'; -- Output: 9000</w:t>
             </w:r>
           </w:p>
         </w:tc>
@@ -3401,13 +4924,13 @@
           <w:rFonts w:ascii="Calibri" w:hAnsi="Calibri"/>
           <w:sz w:val="20"/>
         </w:rPr>
-        <w:t>Analisis: Parameter INOUT membawa nilai harga awal dari pemanggil, dimutasi 10% di dalam procedure, dan nilainya dikembalikan.</w:t>
+        <w:t>Analisis: Mendemonstrasikan parameter INOUT yang membawa harga awal masuk, dipotong oleh procedure, diperbarui ke tabel, dan nilainya dikembalikan ke pemanggil.</w:t>
       </w:r>
     </w:p>
     <w:p>
       <w:pPr>
         <w:keepNext/>
-        <w:spacing w:before="160" w:after="40"/>
+        <w:spacing w:before="180" w:after="40"/>
       </w:pPr>
       <w:r>
         <w:rPr>
@@ -3460,41 +4983,39 @@
               <w:br/>
               <w:t>CREATE PROCEDURE spTambahKasirBaru(</w:t>
               <w:br/>
-              <w:t xml:space="preserve">    IN p_nama VARCHAR(50),</w:t>
-              <w:br/>
-              <w:t xml:space="preserve">    IN p_pass CHAR(6)</w:t>
+              <w:t xml:space="preserve">    IN p_namakasir VARCHAR(50),</w:t>
+              <w:br/>
+              <w:t xml:space="preserve">    IN p_passwordkasir VARCHAR(50)</w:t>
               <w:br/>
               <w:t>)</w:t>
               <w:br/>
               <w:t>BEGIN</w:t>
               <w:br/>
-              <w:t xml:space="preserve">    DECLARE last_code INT DEFAULT 0;</w:t>
-              <w:br/>
-              <w:t xml:space="preserve">    DECLARE new_kodekasir CHAR(3);</w:t>
+              <w:t xml:space="preserve">    DECLARE v_max_id INT DEFAULT 0;</w:t>
+              <w:br/>
+              <w:t xml:space="preserve">    DECLARE v_new_kode CHAR(3);</w:t>
               <w:br/>
               <w:t xml:space="preserve">    </w:t>
               <w:br/>
-              <w:t xml:space="preserve">    -- Validasi panjang password</w:t>
-              <w:br/>
-              <w:t xml:space="preserve">    IF CHAR_LENGTH(p_pass) &lt;&gt; 6 THEN</w:t>
-              <w:br/>
-              <w:t xml:space="preserve">        SIGNAL SQLSTATE '45000' SET MESSAGE_TEXT = 'Error: Password kasir harus tepat 6 karakter.';</w:t>
-              <w:br/>
-              <w:t xml:space="preserve">    END IF;</w:t>
+              <w:t xml:space="preserve">    -- Cari nomor urut kasir terbesar (Format '001', '002', dst)</w:t>
+              <w:br/>
+              <w:t xml:space="preserve">    SELECT IFNULL(MAX(CAST(kodekasir AS UNSIGNED)), 0) INTO v_max_id FROM kasir;</w:t>
+              <w:br/>
+              <w:t xml:space="preserve">    SET v_new_kode = LPAD(v_max_id + 1, 3, '0');</w:t>
               <w:br/>
               <w:t xml:space="preserve">    </w:t>
               <w:br/>
-              <w:t xml:space="preserve">    -- Generate Kode Kasir 3 digit otomatis</w:t>
-              <w:br/>
-              <w:t xml:space="preserve">    SELECT IFNULL(MAX(CAST(kodekasir AS UNSIGNED)), 0) INTO last_code FROM kasir;</w:t>
-              <w:br/>
-              <w:t xml:space="preserve">    SET new_kodekasir = LPAD(last_code + 1, 3, '0');</w:t>
+              <w:t xml:space="preserve">    -- Insert staf kasir baru</w:t>
+              <w:br/>
+              <w:t xml:space="preserve">    INSERT INTO kasir (kodekasir, namakasir, passwordkasir)</w:t>
+              <w:br/>
+              <w:t xml:space="preserve">    VALUES (v_new_kode, p_namakasir, p_passwordkasir);</w:t>
               <w:br/>
               <w:t xml:space="preserve">    </w:t>
               <w:br/>
-              <w:t xml:space="preserve">    INSERT INTO kasir (kodekasir, namakasir, pass) VALUES (new_kodekasir, p_nama, p_pass);</w:t>
-              <w:br/>
-              <w:t xml:space="preserve">    SELECT * FROM kasir WHERE kodekasir = new_kodekasir;</w:t>
+              <w:t xml:space="preserve">    -- Tampilkan kasir yang baru dibuat</w:t>
+              <w:br/>
+              <w:t xml:space="preserve">    SELECT * FROM kasir WHERE kodekasir = v_new_kode;</w:t>
               <w:br/>
               <w:t>END$$</w:t>
               <w:br/>
@@ -3503,7 +5024,7 @@
               <w:br/>
               <w:t>-- Kueri Pengujian:</w:t>
               <w:br/>
-              <w:t>CALL spTambahKasirBaru('Doni Pratama', '123456');</w:t>
+              <w:t>CALL spTambahKasirBaru('Budi Santoso', 'kasir123');</w:t>
             </w:r>
           </w:p>
         </w:tc>
@@ -3532,13 +5053,13 @@
           <w:rFonts w:ascii="Calibri" w:hAnsi="Calibri"/>
           <w:sz w:val="20"/>
         </w:rPr>
-        <w:t>Analisis: Menjamin kepatuhan integritas panjang password kasir (6 karakter) dan auto-numbering kode kasir.</w:t>
+        <w:t>Analisis: Menggunakan fungsi CAST dan LPAD untuk membentuk format string kode numerik berpadding tiga digit secara dinamis.</w:t>
       </w:r>
     </w:p>
     <w:p>
       <w:pPr>
         <w:keepNext/>
-        <w:spacing w:before="160" w:after="40"/>
+        <w:spacing w:before="180" w:after="40"/>
       </w:pPr>
       <w:r>
         <w:rPr>
@@ -3593,17 +5114,23 @@
               <w:br/>
               <w:t>BEGIN</w:t>
               <w:br/>
-              <w:t xml:space="preserve">    DECLARE v_nota CHAR(10);</w:t>
+              <w:t xml:space="preserve">    DECLARE v_nonota CHAR(10);</w:t>
               <w:br/>
               <w:t xml:space="preserve">    DECLARE v_selesai INT DEFAULT 0;</w:t>
               <w:br/>
-              <w:t xml:space="preserve">    DECLARE v_daftar VARCHAR(1000) DEFAULT '';</w:t>
+              <w:t xml:space="preserve">    DECLARE v_daftar_nota TEXT DEFAULT '';</w:t>
               <w:br/>
               <w:t xml:space="preserve">    </w:t>
               <w:br/>
-              <w:t xml:space="preserve">    DECLARE curNota CURSOR FOR </w:t>
-              <w:br/>
-              <w:t xml:space="preserve">        SELECT nonota FROM nota WHERE kodecus = p_kodecus;</w:t>
+              <w:t xml:space="preserve">    -- 1. Deklarasi Cursor untuk mengiterasi nota milik customer bersangkutan</w:t>
+              <w:br/>
+              <w:t xml:space="preserve">    DECLARE curNota CURSOR FOR</w:t>
+              <w:br/>
+              <w:t xml:space="preserve">        SELECT nonota FROM nota WHERE kodecus = p_kodecus ORDER BY tgltran ASC;</w:t>
+              <w:br/>
+              <w:t xml:space="preserve">        </w:t>
+              <w:br/>
+              <w:t xml:space="preserve">    -- 2. Deklarasi Handler NOT FOUND</w:t>
               <w:br/>
               <w:t xml:space="preserve">    DECLARE CONTINUE HANDLER FOR NOT FOUND SET v_selesai = 1;</w:t>
               <w:br/>
@@ -3611,33 +5138,39 @@
               <w:br/>
               <w:t xml:space="preserve">    OPEN curNota;</w:t>
               <w:br/>
-              <w:t xml:space="preserve">    readLoop: LOOP</w:t>
-              <w:br/>
-              <w:t xml:space="preserve">        FETCH curNota INTO v_nota;</w:t>
+              <w:t xml:space="preserve">    </w:t>
+              <w:br/>
+              <w:t xml:space="preserve">    loopNota: LOOP</w:t>
+              <w:br/>
+              <w:t xml:space="preserve">        FETCH curNota INTO v_nonota;</w:t>
               <w:br/>
               <w:t xml:space="preserve">        IF v_selesai = 1 THEN</w:t>
               <w:br/>
-              <w:t xml:space="preserve">            LEAVE readLoop;</w:t>
+              <w:t xml:space="preserve">            LEAVE loopNota;</w:t>
               <w:br/>
               <w:t xml:space="preserve">        END IF;</w:t>
               <w:br/>
-              <w:t xml:space="preserve">        IF v_daftar = '' THEN</w:t>
-              <w:br/>
-              <w:t xml:space="preserve">            SET v_daftar = v_nota;</w:t>
+              <w:t xml:space="preserve">        </w:t>
+              <w:br/>
+              <w:t xml:space="preserve">        IF v_daftar_nota = '' THEN</w:t>
+              <w:br/>
+              <w:t xml:space="preserve">            SET v_daftar_nota = v_nonota;</w:t>
               <w:br/>
               <w:t xml:space="preserve">        ELSE</w:t>
               <w:br/>
-              <w:t xml:space="preserve">            SET v_daftar = CONCAT(v_daftar, ', ', v_nota);</w:t>
+              <w:t xml:space="preserve">            SET v_daftar_nota = CONCAT(v_daftar_nota, ', ', v_nonota);</w:t>
               <w:br/>
               <w:t xml:space="preserve">        END IF;</w:t>
               <w:br/>
-              <w:t xml:space="preserve">    END LOOP readLoop;</w:t>
+              <w:t xml:space="preserve">    END LOOP loopNota;</w:t>
+              <w:br/>
+              <w:t xml:space="preserve">    </w:t>
               <w:br/>
               <w:t xml:space="preserve">    CLOSE curNota;</w:t>
               <w:br/>
               <w:t xml:space="preserve">    </w:t>
               <w:br/>
-              <w:t xml:space="preserve">    SELECT p_kodecus AS Member, IFNULL(NULLIF(v_daftar, ''), 'Belum Pernah Belanja') AS Riwayat_Nota;</w:t>
+              <w:t xml:space="preserve">    SELECT p_kodecus AS customer, v_daftar_nota AS riwayat_nota;</w:t>
               <w:br/>
               <w:t>END$$</w:t>
               <w:br/>
@@ -3675,13 +5208,13 @@
           <w:rFonts w:ascii="Calibri" w:hAnsi="Calibri"/>
           <w:sz w:val="20"/>
         </w:rPr>
-        <w:t>Analisis: Menggunakan cursor untuk menggabungkan sekumpulan nomor nota belanja menjadi satu baris string.</w:t>
+        <w:t>Analisis: Menggunakan CURSOR untuk mengagregasi baris data relasional ke dalam satu representasi teks berpemisah koma.</w:t>
       </w:r>
     </w:p>
     <w:p>
       <w:pPr>
         <w:keepNext/>
-        <w:spacing w:before="160" w:after="40"/>
+        <w:spacing w:before="180" w:after="40"/>
       </w:pPr>
       <w:r>
         <w:rPr>
@@ -3732,51 +5265,63 @@
               </w:rPr>
               <w:t>DELIMITER $$</w:t>
               <w:br/>
-              <w:t>CREATE PROCEDURE spRestokOtomatis(OUT p_jml_produk_direstok INT)</w:t>
+              <w:t>CREATE PROCEDURE spRestokOtomatis()</w:t>
               <w:br/>
               <w:t>BEGIN</w:t>
               <w:br/>
-              <w:t xml:space="preserve">    DECLARE v_kd CHAR(4);</w:t>
+              <w:t xml:space="preserve">    DECLARE v_kodeproduk CHAR(4);</w:t>
               <w:br/>
               <w:t xml:space="preserve">    DECLARE v_selesai INT DEFAULT 0;</w:t>
               <w:br/>
-              <w:t xml:space="preserve">    DECLARE v_counter INT DEFAULT 0;</w:t>
+              <w:t xml:space="preserve">    DECLARE v_count INT DEFAULT 0;</w:t>
               <w:br/>
               <w:t xml:space="preserve">    </w:t>
               <w:br/>
-              <w:t xml:space="preserve">    DECLARE curKritis CURSOR FOR </w:t>
+              <w:t xml:space="preserve">    -- 1. Deklarasi Cursor untuk produk berstok kritis (&lt; 10 unit)</w:t>
+              <w:br/>
+              <w:t xml:space="preserve">    DECLARE curKritis CURSOR FOR</w:t>
               <w:br/>
               <w:t xml:space="preserve">        SELECT kodeproduk FROM produk WHERE stok &lt; 10;</w:t>
               <w:br/>
+              <w:t xml:space="preserve">        </w:t>
+              <w:br/>
+              <w:t xml:space="preserve">    -- 2. Deklarasi Handler NOT FOUND</w:t>
+              <w:br/>
               <w:t xml:space="preserve">    DECLARE CONTINUE HANDLER FOR NOT FOUND SET v_selesai = 1;</w:t>
               <w:br/>
               <w:t xml:space="preserve">    </w:t>
               <w:br/>
               <w:t xml:space="preserve">    OPEN curKritis;</w:t>
               <w:br/>
-              <w:t xml:space="preserve">    restokLoop: LOOP</w:t>
-              <w:br/>
-              <w:t xml:space="preserve">        FETCH curKritis INTO v_kd;</w:t>
+              <w:t xml:space="preserve">    </w:t>
+              <w:br/>
+              <w:t xml:space="preserve">    loopRestok: LOOP</w:t>
+              <w:br/>
+              <w:t xml:space="preserve">        FETCH curKritis INTO v_kodeproduk;</w:t>
               <w:br/>
               <w:t xml:space="preserve">        IF v_selesai = 1 THEN</w:t>
               <w:br/>
-              <w:t xml:space="preserve">            LEAVE restokLoop;</w:t>
+              <w:t xml:space="preserve">            LEAVE loopRestok;</w:t>
               <w:br/>
               <w:t xml:space="preserve">        END IF;</w:t>
               <w:br/>
               <w:t xml:space="preserve">        </w:t>
               <w:br/>
-              <w:t xml:space="preserve">        UPDATE produk SET stok = stok + 50 WHERE kodeproduk = v_kd;</w:t>
-              <w:br/>
-              <w:t xml:space="preserve">        SET v_counter = v_counter + 1;</w:t>
-              <w:br/>
-              <w:t xml:space="preserve">    END LOOP restokLoop;</w:t>
+              <w:t xml:space="preserve">        -- Tambahkan 50 unit ke stok fisik</w:t>
+              <w:br/>
+              <w:t xml:space="preserve">        UPDATE produk SET stok = stok + 50 WHERE kodeproduk = v_kodeproduk;</w:t>
+              <w:br/>
+              <w:t xml:space="preserve">        SET v_count = v_count + 1;</w:t>
+              <w:br/>
+              <w:t xml:space="preserve">    END LOOP loopRestok;</w:t>
+              <w:br/>
+              <w:t xml:space="preserve">    </w:t>
               <w:br/>
               <w:t xml:space="preserve">    CLOSE curKritis;</w:t>
               <w:br/>
               <w:t xml:space="preserve">    </w:t>
               <w:br/>
-              <w:t xml:space="preserve">    SET p_jml_produk_direstok = v_counter;</w:t>
+              <w:t xml:space="preserve">    SELECT CONCAT('Restok otomatis selesai. Jumlah produk yang ditambah stok: ', v_count) AS laporan_restok;</w:t>
               <w:br/>
               <w:t>END$$</w:t>
               <w:br/>
@@ -3785,9 +5330,7 @@
               <w:br/>
               <w:t>-- Kueri Pengujian:</w:t>
               <w:br/>
-              <w:t>CALL spRestokOtomatis(@total_direstok);</w:t>
-              <w:br/>
-              <w:t>SELECT @total_direstok AS 'Jumlah Produk Berhasil Direstok';</w:t>
+              <w:t>CALL spRestokOtomatis();</w:t>
             </w:r>
           </w:p>
         </w:tc>
@@ -3816,13 +5359,13 @@
           <w:rFonts w:ascii="Calibri" w:hAnsi="Calibri"/>
           <w:sz w:val="20"/>
         </w:rPr>
-        <w:t>Analisis: Cursor mengidentifikasi seluruh produk dengan stok kritis dan melakukan penambahan batch 50 unit.</w:t>
+        <w:t>Analisis: Mengotomatisasi penambahan inventori produk kritis dan menghitung akumulasi total baris yang berhasil termutasi.</w:t>
       </w:r>
     </w:p>
     <w:p>
       <w:pPr>
         <w:keepNext/>
-        <w:spacing w:before="160" w:after="40"/>
+        <w:spacing w:before="180" w:after="40"/>
       </w:pPr>
       <w:r>
         <w:rPr>
@@ -3881,7 +5424,7 @@
               <w:br/>
               <w:t xml:space="preserve">    </w:t>
               <w:br/>
-              <w:t xml:space="preserve">    -- Hitung transaksi terkait</w:t>
+              <w:t xml:space="preserve">    -- Periksa apakah customer terikat dengan riwayat nota</w:t>
               <w:br/>
               <w:t xml:space="preserve">    SELECT COUNT(*) INTO v_jml_nota FROM nota WHERE kodecus = p_kodecus;</w:t>
               <w:br/>
@@ -3906,11 +5449,11 @@
               <w:t>DELIMITER ;</w:t>
               <w:br/>
               <w:br/>
-              <w:t>-- Kueri Pengujian (Customer yang memiliki nota M0001 -&gt; Ditolak):</w:t>
+              <w:t>-- Kueri Pengujian (Customer yang memiliki nota M0001 -&gt; Ditolak via SIGNAL):</w:t>
               <w:br/>
               <w:t>CALL spHapusCustomerAman('M0001');</w:t>
               <w:br/>
-              <w:t>-- Hasil: ERROR 1644 (45000): Tidak dapat menghapus customer: Data customer terikat dengan riwayat nota transaksi.</w:t>
+              <w:t>-- Respon: ERROR 1644 (45000): Tidak dapat menghapus customer: Data customer terikat dengan riwayat nota transaksi.</w:t>
             </w:r>
           </w:p>
         </w:tc>
@@ -3939,13 +5482,13 @@
           <w:rFonts w:ascii="Calibri" w:hAnsi="Calibri"/>
           <w:sz w:val="20"/>
         </w:rPr>
-        <w:t>Analisis: Mencegah error foreign key cascaded yang tidak terkontrol dengan validasi logika ramah pengguna via SIGNAL.</w:t>
+        <w:t>Analisis: Mencegah galat foreign key cascaded yang tidak terkontrol dengan menerapkan validasi logika ramah pengguna via SIGNAL SQLSTATE '45000'.</w:t>
       </w:r>
     </w:p>
     <w:p>
       <w:pPr>
         <w:keepNext/>
-        <w:spacing w:before="160" w:after="40"/>
+        <w:spacing w:before="180" w:after="40"/>
       </w:pPr>
       <w:r>
         <w:rPr>
@@ -4014,7 +5557,7 @@
               <w:br/>
               <w:t xml:space="preserve">    </w:t>
               <w:br/>
-              <w:t xml:space="preserve">    -- Rollback otomatis jika ada error database</w:t>
+              <w:t xml:space="preserve">    -- Rollback otomatis jika terjadi eksepsi database</w:t>
               <w:br/>
               <w:t xml:space="preserve">    DECLARE EXIT HANDLER FOR SQLEXCEPTION</w:t>
               <w:br/>
@@ -4101,7 +5644,7 @@
     <w:p>
       <w:pPr>
         <w:keepNext/>
-        <w:spacing w:before="260" w:after="60"/>
+        <w:spacing w:before="280" w:after="80"/>
       </w:pPr>
       <w:r>
         <w:rPr>
@@ -4110,7 +5653,7 @@
           <w:color w:val="14325F"/>
           <w:sz w:val="22"/>
         </w:rPr>
-        <w:t>10. DAFTAR PUSTAKA &amp; REFERENSI RESMI</w:t>
+        <w:t>14. DAFTAR PUSTAKA &amp; REFERENSI RESMI</w:t>
       </w:r>
     </w:p>
     <w:p>

</xml_diff>

<commit_message>
docs(antislop): audit and refactor slide, module, pptx, and script copy for human clarity
</commit_message>
<xml_diff>
--- a/modules/generated/Modul_Pengayaan_SMBD_Lanjut_Procedure_Function.docx
+++ b/modules/generated/Modul_Pengayaan_SMBD_Lanjut_Procedure_Function.docx
@@ -26,7 +26,7 @@
           <w:rFonts w:ascii="Calibri" w:hAnsi="Calibri"/>
           <w:sz w:val="20"/>
         </w:rPr>
-        <w:t>Modul pengayaan ini disusun secara terstruktur untuk melengkapi Materi Praktikum 4 (USER DEFINE FUNCTION &amp; STORE PROCEDURE) pada mata kuliah Sistem Manajemen Basis Data Lanjut (SMBD Lanjut). Fokus utama modul ini adalah menjembatani pemahaman mahasiswa dari materi basis data dasar (DDL, DML, dan View) menuju paradigma pemrograman logika bisnis terkompilasi di sisi server (RDBMS). Modul dilengkapi penjelasan analogi dunia nyata, analisis komparasi hakiki UDF vs Stored Procedure, manajemen parameter (IN, OUT, INOUT), struktur perulangan CURSOR baris per baris, penanganan eksepsi terstruktur (SIGNAL &amp; HANDLER), studi kasus kasir 3NF, metodologi mengajar praktikum bagi asisten, serta 10 latihan soal bertingkat beserta kunci jawaban resmi.</w:t>
+        <w:t>Modul pengayaan ini disusun secara terstruktur untuk melengkapi Materi Praktikum 4 (USER DEFINE FUNCTION &amp; STORE PROCEDURE) pada mata kuliah Sistem Manajemen Basis Data Lanjut (SMBD Lanjut). Fokus utama modul ini adalah menjembatani pemahaman mahasiswa dari materi basis data dasar (DDL, DML, dan View) menuju paradigma pemrograman logika bisnis terkompilasi di sisi server (RDBMS). Modul dilengkapi penjelasan analogi dunia nyata, perbandingan perbedaan UDF vs Stored Procedure, manajemen parameter (IN, OUT, INOUT), struktur perulangan CURSOR baris per baris, penanganan eksepsi terstruktur (SIGNAL &amp; HANDLER), studi kasus kasir 3NF, metodologi mengajar praktikum bagi asisten, serta 10 latihan soal bertingkat beserta kunci jawaban resmi.</w:t>
       </w:r>
     </w:p>
     <w:p>
@@ -218,7 +218,7 @@
           <w:rFonts w:ascii="Calibri" w:hAnsi="Calibri"/>
           <w:sz w:val="20"/>
         </w:rPr>
-        <w:t>Dalam rekayasa sistem basis data relasional enterprise (seperti MySQL, MariaDB, Oracle, PostgreSQL), Stored Routine adalah blok instruksi SQL terkompilasi yang disimpan secara permanen di dalam data dictionary (katalog sistem) dan dieksekusi langsung oleh server database engine. Memindahkan logika bisnis dari aplikasi klien langsung ke RDBMS memberikan 4 keunggulan:</w:t>
+        <w:t>Pada sistem basis data relasional (RDBMS) seperti MySQL, MariaDB, Oracle, atau PostgreSQL, Stored Routine adalah blok instruksi SQL terkompilasi yang disimpan secara permanen di dalam data dictionary (katalog sistem) dan dieksekusi langsung oleh server database engine. Memindahkan logika bisnis dari aplikasi klien langsung ke RDBMS memberikan 4 keunggulan:</w:t>
       </w:r>
     </w:p>
     <w:p>
@@ -249,7 +249,7 @@
           <w:rFonts w:ascii="Calibri" w:hAnsi="Calibri"/>
           <w:sz w:val="20"/>
         </w:rPr>
-        <w:t>Pada arsitektur konvensional, aplikasi klien harus mengirimkan belasan kueri SELECT dan UPDATE secara bolak-balik melalui jaringan kabel/WiFi. Dengan Stored Routine, aplikasi cukup mengirimkan satu baris perintah CALL, dan seluruh rangkaian kueri dieksekusi langsung di RAM server, memangkas latensi jaringan secara signifikan.</w:t>
+        <w:t>Pada arsitektur konvensional, aplikasi klien harus mengirimkan belasan kueri SELECT dan UPDATE secara bolak-balik melalui jaringan kabel/WiFi. Dengan Stored Routine, aplikasi cukup mengirimkan satu baris perintah CALL, dan seluruh rangkaian kueri dieksekusi langsung di RAM server, mengurangi latensi jaringan.</w:t>
       </w:r>
     </w:p>
     <w:p>
@@ -280,7 +280,7 @@
           <w:rFonts w:ascii="Calibri" w:hAnsi="Calibri"/>
           <w:sz w:val="20"/>
         </w:rPr>
-        <w:t>Aturan bisnis krusial (misal kalkulasi poin reward, diskon member, validasi batas minimum stok) didefinisikan satu kali secara terpusat di basis data. Seluruh aplikasi klien memakai aturan yang sama persis, menjamin konsistensi mutlak.</w:t>
+        <w:t>Aturan bisnis krusial (misal kalkulasi poin reward, diskon member, validasi batas minimum stok) didefinisikan satu kali secara terpusat di basis data. Seluruh aplikasi klien memakai aturan yang sama persis, menjaga konsistensi data.</w:t>
       </w:r>
     </w:p>
     <w:p>
@@ -357,7 +357,7 @@
           <w:color w:val="14325F"/>
           <w:sz w:val="22"/>
         </w:rPr>
-        <w:t>3. PERBEDAAN HAKIKI: FUNCTION (UDF) VS STORED PROCEDURE</w:t>
+        <w:t>3. PERBEDAAN UTAMA: FUNCTION (UDF) VS STORED PROCEDURE</w:t>
       </w:r>
     </w:p>
     <w:p>
@@ -2806,7 +2806,7 @@
           <w:rFonts w:ascii="Calibri" w:hAnsi="Calibri"/>
           <w:sz w:val="20"/>
         </w:rPr>
-        <w:t>Prosedur spCheckoutTransaksi di bawah ini berfungsi sebagai studi kasus terpadu tingkat enterprise. Prosedur ini menggabungkan seluruh konsep yang telah dipelajari sebelumnya ke dalam satu alur transaksi kasir nyata:</w:t>
+        <w:t>Prosedur spCheckoutTransaksi di bawah ini berfungsi sebagai studi kasus terpadu transaksi minimarket. Prosedur ini menggabungkan seluruh konsep yang telah dipelajari sebelumnya ke dalam satu alur transaksi kasir nyata:</w:t>
         <w:br/>
         <w:t>• Memanggil UDF (fcGenerateNoNota dan fcHitungPoinBelanja)</w:t>
         <w:br/>
@@ -3111,7 +3111,7 @@
           <w:color w:val="1E1E1E"/>
           <w:sz w:val="20"/>
         </w:rPr>
-        <w:t xml:space="preserve">Langkah 3: Tuntaskan Misteri DELIMITER: </w:t>
+        <w:t xml:space="preserve">Langkah 3: Alasan Penggunaan DELIMITER: </w:t>
       </w:r>
       <w:r>
         <w:rPr>
@@ -3211,7 +3211,7 @@
           <w:rFonts w:ascii="Calibri" w:hAnsi="Calibri"/>
           <w:sz w:val="20"/>
         </w:rPr>
-        <w:t>Gunakan analogi membaca daftar absensi mahasiswa. Wajibkan mahasiswa menghafal 5 urutan mutlak: DECLARE CURSOR -&gt; DECLARE HANDLER NOT FOUND -&gt; OPEN -&gt; FETCH di LOOP -&gt; CLOSE. Jelaskan fungsi variabel bendera v_selesai.</w:t>
+        <w:t>Gunakan analogi membaca daftar absensi mahasiswa. Arahkan mahasiswa memahami 5 tahapan berurutan: DECLARE CURSOR -&gt; DECLARE HANDLER NOT FOUND -&gt; OPEN -&gt; FETCH di LOOP -&gt; CLOSE. Jelaskan fungsi variabel bendera v_selesai.</w:t>
       </w:r>
     </w:p>
     <w:p>

</xml_diff>